<commit_message>
Refine V3 report for collaborators
</commit_message>
<xml_diff>
--- a/docs/result_artifacts/weekly_report_result/Nb252_V3_expression_report/Nb252_BL21_expression_optimization_V3_project_report.docx
+++ b/docs/result_artifacts/weekly_report_result/Nb252_V3_expression_report/Nb252_BL21_expression_optimization_V3_project_report.docx
@@ -483,7 +483,7 @@
           <w:rFonts w:ascii="Microsoft YaHei" w:hAnsi="Microsoft YaHei" w:eastAsia="Microsoft YaHei" w:cs="Microsoft YaHei"/>
           <w:color w:val="000000"/>
         </w:rPr>
-        <w:t>最终选定15条父单突；完整枚举105个理论配对并去除3个同位点无效组合后，对102条双突全部重算U/S/Tm，再选定15条双突。</w:t>
+        <w:t>最终选定15条用于构建双突的组成单突（下文简称“父单突”）；完整枚举105个理论配对并去除3个同位点无效组合后，对102条双突全部重算U/S/Tm，再选定15条双突。</w:t>
       </w:r>
     </w:p>
     <w:p>
@@ -501,6 +501,7 @@
     <w:p>
       <w:pPr>
         <w:pStyle w:val="Heading2"/>
+        <w:pageBreakBefore w:val="0"/>
       </w:pPr>
       <w:r>
         <w:t>内容概览</w:t>
@@ -854,7 +855,7 @@
                 <w:color w:val="000000"/>
                 <w:sz w:val="18"/>
               </w:rPr>
-              <w:t>10–12</w:t>
+              <w:t>10–11</w:t>
             </w:r>
           </w:p>
         </w:tc>
@@ -881,7 +882,7 @@
                 <w:color w:val="000000"/>
                 <w:sz w:val="18"/>
               </w:rPr>
-              <w:t>最终面板、风险边界与实验验证建议</w:t>
+              <w:t>最终面板与风险边界</w:t>
             </w:r>
           </w:p>
         </w:tc>
@@ -1730,7 +1731,7 @@
                 <w:color w:val="000000"/>
                 <w:sz w:val="17"/>
               </w:rPr>
-              <w:t>不替代折叠与二硫键实验质控</w:t>
+              <w:t>不替代折叠与二硫键的实验检查</w:t>
             </w:r>
           </w:p>
         </w:tc>
@@ -2561,6 +2562,7 @@
     <w:p>
       <w:pPr>
         <w:pStyle w:val="Heading2"/>
+        <w:pageBreakBefore w:val="0"/>
       </w:pPr>
       <w:r>
         <w:t>AntiFold双条件排除规则</w:t>
@@ -2590,7 +2592,7 @@
           <w:rFonts w:ascii="Microsoft YaHei" w:hAnsi="Microsoft YaHei" w:eastAsia="Microsoft YaHei" w:cs="Microsoft YaHei"/>
           <w:color w:val="000000"/>
         </w:rPr>
-        <w:t>硬约束后形成847条允许单突，覆盖48个reported位置。该空间由47个常规开放位点的非WT、非Cys替换，加上Q5V这一条受限共识回变构成。所有847条均完成NetSolP U/S、NanoMelt Tm、AntiFold风险门与序列责任检查。</w:t>
+        <w:t>硬约束后形成847条允许单突，覆盖48个reported位置。该空间由47个常规开放位点的非WT、非Cys替换，加上Q5V这一条受限共识回变构成。所有847条均完成NetSolP U/S、NanoMelt Tm、AntiFold风险门与序列风险检查。</w:t>
       </w:r>
     </w:p>
     <w:p>
@@ -2599,7 +2601,7 @@
           <w:rFonts w:ascii="Microsoft YaHei" w:hAnsi="Microsoft YaHei" w:eastAsia="Microsoft YaHei" w:cs="Microsoft YaHei"/>
           <w:color w:val="000000"/>
         </w:rPr>
-        <w:t>AntiFold双条件风险门排除151条，696条未触发；性质资格层共有61条。AntiFold的151条排除只代表结构相容性风险门，不改变U/S/Tm的性质幅度定义。</w:t>
+        <w:t>AntiFold双条件风险门排除151条，696条未触发；其中61条符合预设的U/S/Tm性质条件。AntiFold的151条排除只代表结构相容性风险门，不改变U/S/Tm的性质幅度定义。</w:t>
       </w:r>
     </w:p>
     <w:tbl>
@@ -3279,7 +3281,16 @@
           <w:rFonts w:ascii="Microsoft YaHei" w:hAnsi="Microsoft YaHei" w:eastAsia="Microsoft YaHei" w:cs="Microsoft YaHei"/>
           <w:color w:val="000000"/>
         </w:rPr>
-        <w:t>单突选择先要求不触发硬约束、序列硬风险与AntiFold双条件排除，再以U/S/Tm的中等或显著改善为主要正向证据。61条性质合格候选经位置与替换多样性抽取形成30条代表性短名单；另加入T99F作为稳定词假设探索项，形成31条专家审查池。</w:t>
+        <w:t>这里的“硬约束”指禁止改变24个实验直接界面位点、天然保守冻结位点、Cys22/Cys95和末端125–128位SSGS，同时禁止新增Cys；“序列硬风险”指新增Pro造成主链构象约束、突变所在7-aa窗口出现至少6个疏水残基且比WT增加，或任一7-aa窗口的净侧链电荷绝对值达到至少5且比WT增加。单突只有在不触发这些规则和AntiFold双条件排除后，才以U/S/Tm的中等或显著改善作为主要正向证据。</w:t>
+      </w:r>
+    </w:p>
+    <w:p>
+      <w:r>
+        <w:rPr>
+          <w:rFonts w:ascii="Microsoft YaHei" w:hAnsi="Microsoft YaHei" w:eastAsia="Microsoft YaHei" w:cs="Microsoft YaHei"/>
+          <w:color w:val="000000"/>
+        </w:rPr>
+        <w:t>61条性质合格候选经位置与替换多样性抽取形成30条代表性短名单；另加入T99F作为“稳定词”探索项，形成31条专家审查池。稳定词是用简并氨基酸符号表示、被假设可能与稳定性有关的短序列模式，在本项目中仅作为探索性软证据。</w:t>
       </w:r>
     </w:p>
     <w:p>
@@ -3291,6 +3302,553 @@
         <w:t>专家审查仅在有高置信度、具体且不可由其他证据合理抵消的物理风险时执行硬排除，共排除5条；其余担忧作为降级或实验注释。最终15条覆盖12个位点，其中9条至少有一项显著有利指标，5条以多指标中等证据或机制互补入选，T99F为唯一探索例外。</w:t>
       </w:r>
     </w:p>
+    <w:tbl>
+      <w:tblPr>
+        <w:tblW w:type="dxa" w:w="9500"/>
+        <w:jc w:val="center"/>
+        <w:tblLayout w:type="fixed"/>
+        <w:tblLook w:firstColumn="1" w:firstRow="1" w:lastColumn="0" w:lastRow="0" w:noHBand="0" w:noVBand="1" w:val="04A0"/>
+        <w:tblBorders>
+          <w:top w:val="single" w:sz="12" w:color="000000" w:space="0"/>
+          <w:bottom w:val="single" w:sz="12" w:color="000000" w:space="0"/>
+          <w:left w:val="nil" w:sz="0" w:color="000000" w:space="0"/>
+          <w:right w:val="nil" w:sz="0" w:color="000000" w:space="0"/>
+          <w:insideH w:val="nil" w:sz="0" w:color="000000" w:space="0"/>
+          <w:insideV w:val="nil" w:sz="0" w:color="000000" w:space="0"/>
+        </w:tblBorders>
+      </w:tblPr>
+      <w:tblGrid>
+        <w:gridCol w:w="1421"/>
+        <w:gridCol w:w="2575"/>
+        <w:gridCol w:w="5504"/>
+      </w:tblGrid>
+      <w:tr>
+        <w:trPr>
+          <w:tblHeader w:val="true"/>
+          <w:cantSplit/>
+        </w:trPr>
+        <w:tc>
+          <w:tcPr>
+            <w:tcW w:type="dxa" w:w="1421"/>
+            <w:vAlign w:val="center"/>
+            <w:tcMar>
+              <w:top w:w="70" w:type="dxa"/>
+              <w:bottom w:w="70" w:type="dxa"/>
+              <w:start w:w="95" w:type="dxa"/>
+              <w:end w:w="95" w:type="dxa"/>
+            </w:tcMar>
+            <w:tcBorders>
+              <w:bottom w:val="single" w:sz="8" w:color="000000" w:space="0"/>
+            </w:tcBorders>
+          </w:tcPr>
+          <w:p>
+            <w:pPr>
+              <w:spacing w:after="0" w:line="247" w:lineRule="auto"/>
+            </w:pPr>
+            <w:r/>
+            <w:r>
+              <w:rPr>
+                <w:rFonts w:ascii="Microsoft YaHei" w:hAnsi="Microsoft YaHei" w:eastAsia="Microsoft YaHei" w:cs="Microsoft YaHei"/>
+                <w:b/>
+                <w:color w:val="000000"/>
+                <w:sz w:val="16"/>
+              </w:rPr>
+              <w:t>排除突变</w:t>
+            </w:r>
+          </w:p>
+        </w:tc>
+        <w:tc>
+          <w:tcPr>
+            <w:tcW w:type="dxa" w:w="2575"/>
+            <w:vAlign w:val="center"/>
+            <w:tcMar>
+              <w:top w:w="70" w:type="dxa"/>
+              <w:bottom w:w="70" w:type="dxa"/>
+              <w:start w:w="95" w:type="dxa"/>
+              <w:end w:w="95" w:type="dxa"/>
+            </w:tcMar>
+            <w:tcBorders>
+              <w:bottom w:val="single" w:sz="8" w:color="000000" w:space="0"/>
+            </w:tcBorders>
+          </w:tcPr>
+          <w:p>
+            <w:pPr>
+              <w:spacing w:after="0" w:line="247" w:lineRule="auto"/>
+            </w:pPr>
+            <w:r/>
+            <w:r>
+              <w:rPr>
+                <w:rFonts w:ascii="Microsoft YaHei" w:hAnsi="Microsoft YaHei" w:eastAsia="Microsoft YaHei" w:cs="Microsoft YaHei"/>
+                <w:b/>
+                <w:color w:val="000000"/>
+                <w:sz w:val="16"/>
+              </w:rPr>
+              <w:t>主要物理风险</w:t>
+            </w:r>
+          </w:p>
+        </w:tc>
+        <w:tc>
+          <w:tcPr>
+            <w:tcW w:type="dxa" w:w="5504"/>
+            <w:vAlign w:val="center"/>
+            <w:tcMar>
+              <w:top w:w="70" w:type="dxa"/>
+              <w:bottom w:w="70" w:type="dxa"/>
+              <w:start w:w="95" w:type="dxa"/>
+              <w:end w:w="95" w:type="dxa"/>
+            </w:tcMar>
+            <w:tcBorders>
+              <w:bottom w:val="single" w:sz="8" w:color="000000" w:space="0"/>
+            </w:tcBorders>
+          </w:tcPr>
+          <w:p>
+            <w:pPr>
+              <w:spacing w:after="0" w:line="247" w:lineRule="auto"/>
+            </w:pPr>
+            <w:r/>
+            <w:r>
+              <w:rPr>
+                <w:rFonts w:ascii="Microsoft YaHei" w:hAnsi="Microsoft YaHei" w:eastAsia="Microsoft YaHei" w:cs="Microsoft YaHei"/>
+                <w:b/>
+                <w:color w:val="000000"/>
+                <w:sz w:val="16"/>
+              </w:rPr>
+              <w:t>专家排除依据</w:t>
+            </w:r>
+          </w:p>
+        </w:tc>
+      </w:tr>
+      <w:tr>
+        <w:trPr>
+          <w:cantSplit/>
+        </w:trPr>
+        <w:tc>
+          <w:tcPr>
+            <w:tcW w:type="dxa" w:w="1421"/>
+            <w:vAlign w:val="center"/>
+            <w:tcMar>
+              <w:top w:w="70" w:type="dxa"/>
+              <w:bottom w:w="70" w:type="dxa"/>
+              <w:start w:w="95" w:type="dxa"/>
+              <w:end w:w="95" w:type="dxa"/>
+            </w:tcMar>
+          </w:tcPr>
+          <w:p>
+            <w:pPr>
+              <w:spacing w:after="0" w:line="247" w:lineRule="auto"/>
+            </w:pPr>
+            <w:r/>
+            <w:r>
+              <w:rPr>
+                <w:rFonts w:ascii="Microsoft YaHei" w:hAnsi="Microsoft YaHei" w:eastAsia="Microsoft YaHei" w:cs="Microsoft YaHei"/>
+                <w:b w:val="0"/>
+                <w:color w:val="000000"/>
+                <w:sz w:val="16"/>
+              </w:rPr>
+              <w:t>A49F</w:t>
+            </w:r>
+          </w:p>
+        </w:tc>
+        <w:tc>
+          <w:tcPr>
+            <w:tcW w:type="dxa" w:w="2575"/>
+            <w:vAlign w:val="center"/>
+            <w:tcMar>
+              <w:top w:w="70" w:type="dxa"/>
+              <w:bottom w:w="70" w:type="dxa"/>
+              <w:start w:w="95" w:type="dxa"/>
+              <w:end w:w="95" w:type="dxa"/>
+            </w:tcMar>
+          </w:tcPr>
+          <w:p>
+            <w:pPr>
+              <w:spacing w:after="0" w:line="247" w:lineRule="auto"/>
+            </w:pPr>
+            <w:r/>
+            <w:r>
+              <w:rPr>
+                <w:rFonts w:ascii="Microsoft YaHei" w:hAnsi="Microsoft YaHei" w:eastAsia="Microsoft YaHei" w:cs="Microsoft YaHei"/>
+                <w:b w:val="0"/>
+                <w:color w:val="000000"/>
+                <w:sz w:val="16"/>
+              </w:rPr>
+              <w:t>埋藏核心过度包装</w:t>
+            </w:r>
+          </w:p>
+        </w:tc>
+        <w:tc>
+          <w:tcPr>
+            <w:tcW w:type="dxa" w:w="5504"/>
+            <w:vAlign w:val="center"/>
+            <w:tcMar>
+              <w:top w:w="70" w:type="dxa"/>
+              <w:bottom w:w="70" w:type="dxa"/>
+              <w:start w:w="95" w:type="dxa"/>
+              <w:end w:w="95" w:type="dxa"/>
+            </w:tcMar>
+          </w:tcPr>
+          <w:p>
+            <w:pPr>
+              <w:spacing w:after="0" w:line="247" w:lineRule="auto"/>
+            </w:pPr>
+            <w:r/>
+            <w:r>
+              <w:rPr>
+                <w:rFonts w:ascii="Microsoft YaHei" w:hAnsi="Microsoft YaHei" w:eastAsia="Microsoft YaHei" w:cs="Microsoft YaHei"/>
+                <w:b w:val="0"/>
+                <w:color w:val="000000"/>
+                <w:sz w:val="16"/>
+              </w:rPr>
+              <w:t>小体积Ala替换为大芳香侧链，实验结构支持高置信空间拥挤风险。</w:t>
+            </w:r>
+          </w:p>
+        </w:tc>
+      </w:tr>
+      <w:tr>
+        <w:trPr>
+          <w:cantSplit/>
+        </w:trPr>
+        <w:tc>
+          <w:tcPr>
+            <w:tcW w:type="dxa" w:w="1421"/>
+            <w:vAlign w:val="center"/>
+            <w:tcMar>
+              <w:top w:w="70" w:type="dxa"/>
+              <w:bottom w:w="70" w:type="dxa"/>
+              <w:start w:w="95" w:type="dxa"/>
+              <w:end w:w="95" w:type="dxa"/>
+            </w:tcMar>
+          </w:tcPr>
+          <w:p>
+            <w:pPr>
+              <w:spacing w:after="0" w:line="247" w:lineRule="auto"/>
+            </w:pPr>
+            <w:r/>
+            <w:r>
+              <w:rPr>
+                <w:rFonts w:ascii="Microsoft YaHei" w:hAnsi="Microsoft YaHei" w:eastAsia="Microsoft YaHei" w:cs="Microsoft YaHei"/>
+                <w:b w:val="0"/>
+                <w:color w:val="000000"/>
+                <w:sz w:val="16"/>
+              </w:rPr>
+              <w:t>A49M</w:t>
+            </w:r>
+          </w:p>
+        </w:tc>
+        <w:tc>
+          <w:tcPr>
+            <w:tcW w:type="dxa" w:w="2575"/>
+            <w:vAlign w:val="center"/>
+            <w:tcMar>
+              <w:top w:w="70" w:type="dxa"/>
+              <w:bottom w:w="70" w:type="dxa"/>
+              <w:start w:w="95" w:type="dxa"/>
+              <w:end w:w="95" w:type="dxa"/>
+            </w:tcMar>
+          </w:tcPr>
+          <w:p>
+            <w:pPr>
+              <w:spacing w:after="0" w:line="247" w:lineRule="auto"/>
+            </w:pPr>
+            <w:r/>
+            <w:r>
+              <w:rPr>
+                <w:rFonts w:ascii="Microsoft YaHei" w:hAnsi="Microsoft YaHei" w:eastAsia="Microsoft YaHei" w:cs="Microsoft YaHei"/>
+                <w:b w:val="0"/>
+                <w:color w:val="000000"/>
+                <w:sz w:val="16"/>
+              </w:rPr>
+              <w:t>埋藏核心过度包装与氧化</w:t>
+            </w:r>
+          </w:p>
+        </w:tc>
+        <w:tc>
+          <w:tcPr>
+            <w:tcW w:type="dxa" w:w="5504"/>
+            <w:vAlign w:val="center"/>
+            <w:tcMar>
+              <w:top w:w="70" w:type="dxa"/>
+              <w:bottom w:w="70" w:type="dxa"/>
+              <w:start w:w="95" w:type="dxa"/>
+              <w:end w:w="95" w:type="dxa"/>
+            </w:tcMar>
+          </w:tcPr>
+          <w:p>
+            <w:pPr>
+              <w:spacing w:after="0" w:line="247" w:lineRule="auto"/>
+            </w:pPr>
+            <w:r/>
+            <w:r>
+              <w:rPr>
+                <w:rFonts w:ascii="Microsoft YaHei" w:hAnsi="Microsoft YaHei" w:eastAsia="Microsoft YaHei" w:cs="Microsoft YaHei"/>
+                <w:b w:val="0"/>
+                <w:color w:val="000000"/>
+                <w:sz w:val="16"/>
+              </w:rPr>
+              <w:t>埋藏Ala替换为较大Met，兼有空间拥挤和新增氧化敏感性。</w:t>
+            </w:r>
+          </w:p>
+        </w:tc>
+      </w:tr>
+      <w:tr>
+        <w:trPr>
+          <w:cantSplit/>
+        </w:trPr>
+        <w:tc>
+          <w:tcPr>
+            <w:tcW w:type="dxa" w:w="1421"/>
+            <w:vAlign w:val="center"/>
+            <w:tcMar>
+              <w:top w:w="70" w:type="dxa"/>
+              <w:bottom w:w="70" w:type="dxa"/>
+              <w:start w:w="95" w:type="dxa"/>
+              <w:end w:w="95" w:type="dxa"/>
+            </w:tcMar>
+          </w:tcPr>
+          <w:p>
+            <w:pPr>
+              <w:spacing w:after="0" w:line="247" w:lineRule="auto"/>
+            </w:pPr>
+            <w:r/>
+            <w:r>
+              <w:rPr>
+                <w:rFonts w:ascii="Microsoft YaHei" w:hAnsi="Microsoft YaHei" w:eastAsia="Microsoft YaHei" w:cs="Microsoft YaHei"/>
+                <w:b w:val="0"/>
+                <w:color w:val="000000"/>
+                <w:sz w:val="16"/>
+              </w:rPr>
+              <w:t>S50F</w:t>
+            </w:r>
+          </w:p>
+        </w:tc>
+        <w:tc>
+          <w:tcPr>
+            <w:tcW w:type="dxa" w:w="2575"/>
+            <w:vAlign w:val="center"/>
+            <w:tcMar>
+              <w:top w:w="70" w:type="dxa"/>
+              <w:bottom w:w="70" w:type="dxa"/>
+              <w:start w:w="95" w:type="dxa"/>
+              <w:end w:w="95" w:type="dxa"/>
+            </w:tcMar>
+          </w:tcPr>
+          <w:p>
+            <w:pPr>
+              <w:spacing w:after="0" w:line="247" w:lineRule="auto"/>
+            </w:pPr>
+            <w:r/>
+            <w:r>
+              <w:rPr>
+                <w:rFonts w:ascii="Microsoft YaHei" w:hAnsi="Microsoft YaHei" w:eastAsia="Microsoft YaHei" w:cs="Microsoft YaHei"/>
+                <w:b w:val="0"/>
+                <w:color w:val="000000"/>
+                <w:sz w:val="16"/>
+              </w:rPr>
+              <w:t>局部过度包装</w:t>
+            </w:r>
+          </w:p>
+        </w:tc>
+        <w:tc>
+          <w:tcPr>
+            <w:tcW w:type="dxa" w:w="5504"/>
+            <w:vAlign w:val="center"/>
+            <w:tcMar>
+              <w:top w:w="70" w:type="dxa"/>
+              <w:bottom w:w="70" w:type="dxa"/>
+              <w:start w:w="95" w:type="dxa"/>
+              <w:end w:w="95" w:type="dxa"/>
+            </w:tcMar>
+          </w:tcPr>
+          <w:p>
+            <w:pPr>
+              <w:spacing w:after="0" w:line="247" w:lineRule="auto"/>
+            </w:pPr>
+            <w:r/>
+            <w:r>
+              <w:rPr>
+                <w:rFonts w:ascii="Microsoft YaHei" w:hAnsi="Microsoft YaHei" w:eastAsia="Microsoft YaHei" w:cs="Microsoft YaHei"/>
+                <w:b w:val="0"/>
+                <w:color w:val="000000"/>
+                <w:sz w:val="16"/>
+              </w:rPr>
+              <w:t>部分埋藏且靠近受体的Ser替换为大芳香侧链，局部碰撞与疏水暴露风险同向。</w:t>
+            </w:r>
+          </w:p>
+        </w:tc>
+      </w:tr>
+      <w:tr>
+        <w:trPr>
+          <w:cantSplit/>
+        </w:trPr>
+        <w:tc>
+          <w:tcPr>
+            <w:tcW w:type="dxa" w:w="1421"/>
+            <w:vAlign w:val="center"/>
+            <w:tcMar>
+              <w:top w:w="70" w:type="dxa"/>
+              <w:bottom w:w="70" w:type="dxa"/>
+              <w:start w:w="95" w:type="dxa"/>
+              <w:end w:w="95" w:type="dxa"/>
+            </w:tcMar>
+          </w:tcPr>
+          <w:p>
+            <w:pPr>
+              <w:spacing w:after="0" w:line="247" w:lineRule="auto"/>
+            </w:pPr>
+            <w:r/>
+            <w:r>
+              <w:rPr>
+                <w:rFonts w:ascii="Microsoft YaHei" w:hAnsi="Microsoft YaHei" w:eastAsia="Microsoft YaHei" w:cs="Microsoft YaHei"/>
+                <w:b w:val="0"/>
+                <w:color w:val="000000"/>
+                <w:sz w:val="16"/>
+              </w:rPr>
+              <w:t>R71G</w:t>
+            </w:r>
+          </w:p>
+        </w:tc>
+        <w:tc>
+          <w:tcPr>
+            <w:tcW w:type="dxa" w:w="2575"/>
+            <w:vAlign w:val="center"/>
+            <w:tcMar>
+              <w:top w:w="70" w:type="dxa"/>
+              <w:bottom w:w="70" w:type="dxa"/>
+              <w:start w:w="95" w:type="dxa"/>
+              <w:end w:w="95" w:type="dxa"/>
+            </w:tcMar>
+          </w:tcPr>
+          <w:p>
+            <w:pPr>
+              <w:spacing w:after="0" w:line="247" w:lineRule="auto"/>
+            </w:pPr>
+            <w:r/>
+            <w:r>
+              <w:rPr>
+                <w:rFonts w:ascii="Microsoft YaHei" w:hAnsi="Microsoft YaHei" w:eastAsia="Microsoft YaHei" w:cs="Microsoft YaHei"/>
+                <w:b w:val="0"/>
+                <w:color w:val="000000"/>
+                <w:sz w:val="16"/>
+              </w:rPr>
+              <w:t>极性网络与构象稳定性损失</w:t>
+            </w:r>
+          </w:p>
+        </w:tc>
+        <w:tc>
+          <w:tcPr>
+            <w:tcW w:type="dxa" w:w="5504"/>
+            <w:vAlign w:val="center"/>
+            <w:tcMar>
+              <w:top w:w="70" w:type="dxa"/>
+              <w:bottom w:w="70" w:type="dxa"/>
+              <w:start w:w="95" w:type="dxa"/>
+              <w:end w:w="95" w:type="dxa"/>
+            </w:tcMar>
+          </w:tcPr>
+          <w:p>
+            <w:pPr>
+              <w:spacing w:after="0" w:line="247" w:lineRule="auto"/>
+            </w:pPr>
+            <w:r/>
+            <w:r>
+              <w:rPr>
+                <w:rFonts w:ascii="Microsoft YaHei" w:hAnsi="Microsoft YaHei" w:eastAsia="Microsoft YaHei" w:cs="Microsoft YaHei"/>
+                <w:b w:val="0"/>
+                <w:color w:val="000000"/>
+                <w:sz w:val="16"/>
+              </w:rPr>
+              <w:t>去除内部Arg极性接触，并在非典型转角位置引入Gly柔性。</w:t>
+            </w:r>
+          </w:p>
+        </w:tc>
+      </w:tr>
+      <w:tr>
+        <w:trPr>
+          <w:cantSplit/>
+        </w:trPr>
+        <w:tc>
+          <w:tcPr>
+            <w:tcW w:type="dxa" w:w="1421"/>
+            <w:vAlign w:val="center"/>
+            <w:tcMar>
+              <w:top w:w="70" w:type="dxa"/>
+              <w:bottom w:w="70" w:type="dxa"/>
+              <w:start w:w="95" w:type="dxa"/>
+              <w:end w:w="95" w:type="dxa"/>
+            </w:tcMar>
+          </w:tcPr>
+          <w:p>
+            <w:pPr>
+              <w:spacing w:after="0" w:line="247" w:lineRule="auto"/>
+            </w:pPr>
+            <w:r/>
+            <w:r>
+              <w:rPr>
+                <w:rFonts w:ascii="Microsoft YaHei" w:hAnsi="Microsoft YaHei" w:eastAsia="Microsoft YaHei" w:cs="Microsoft YaHei"/>
+                <w:b w:val="0"/>
+                <w:color w:val="000000"/>
+                <w:sz w:val="16"/>
+              </w:rPr>
+              <w:t>A96R</w:t>
+            </w:r>
+          </w:p>
+        </w:tc>
+        <w:tc>
+          <w:tcPr>
+            <w:tcW w:type="dxa" w:w="2575"/>
+            <w:vAlign w:val="center"/>
+            <w:tcMar>
+              <w:top w:w="70" w:type="dxa"/>
+              <w:bottom w:w="70" w:type="dxa"/>
+              <w:start w:w="95" w:type="dxa"/>
+              <w:end w:w="95" w:type="dxa"/>
+            </w:tcMar>
+          </w:tcPr>
+          <w:p>
+            <w:pPr>
+              <w:spacing w:after="0" w:line="247" w:lineRule="auto"/>
+            </w:pPr>
+            <w:r/>
+            <w:r>
+              <w:rPr>
+                <w:rFonts w:ascii="Microsoft YaHei" w:hAnsi="Microsoft YaHei" w:eastAsia="Microsoft YaHei" w:cs="Microsoft YaHei"/>
+                <w:b w:val="0"/>
+                <w:color w:val="000000"/>
+                <w:sz w:val="16"/>
+              </w:rPr>
+              <w:t>埋藏电荷与二硫键邻近</w:t>
+            </w:r>
+          </w:p>
+        </w:tc>
+        <w:tc>
+          <w:tcPr>
+            <w:tcW w:type="dxa" w:w="5504"/>
+            <w:vAlign w:val="center"/>
+            <w:tcMar>
+              <w:top w:w="70" w:type="dxa"/>
+              <w:bottom w:w="70" w:type="dxa"/>
+              <w:start w:w="95" w:type="dxa"/>
+              <w:end w:w="95" w:type="dxa"/>
+            </w:tcMar>
+          </w:tcPr>
+          <w:p>
+            <w:pPr>
+              <w:spacing w:after="0" w:line="247" w:lineRule="auto"/>
+            </w:pPr>
+            <w:r/>
+            <w:r>
+              <w:rPr>
+                <w:rFonts w:ascii="Microsoft YaHei" w:hAnsi="Microsoft YaHei" w:eastAsia="Microsoft YaHei" w:cs="Microsoft YaHei"/>
+                <w:b w:val="0"/>
+                <w:color w:val="000000"/>
+                <w:sz w:val="16"/>
+              </w:rPr>
+              <w:t>深埋Ala替换为大体积带电Arg，且邻近Cys95，包装与折叠风险明确。</w:t>
+            </w:r>
+          </w:p>
+        </w:tc>
+      </w:tr>
+    </w:tbl>
     <w:p>
       <w:r>
         <w:rPr>
@@ -3405,7 +3963,7 @@
           <w:color w:val="000000"/>
           <w:sz w:val="18"/>
         </w:rPr>
-        <w:t>图5  15条父单突的U/S/Tm幅度档。颜色表示预设幅度类别；AF3补充、潜在化学责任与T99F探索属性仅作注释。</w:t>
+        <w:t>图5  15条父单突的U/S/Tm幅度档。颜色表示预设幅度类别；AF3补充、潜在化学风险与T99F探索属性仅作注释。</w:t>
       </w:r>
     </w:p>
     <w:p>
@@ -3423,15 +3981,7 @@
           <w:rFonts w:ascii="Microsoft YaHei" w:hAnsi="Microsoft YaHei" w:eastAsia="Microsoft YaHei" w:cs="Microsoft YaHei"/>
           <w:color w:val="000000"/>
         </w:rPr>
-        <w:t>下表按固定展示顺序列出15条父单突；顺序用于交付与追溯，不是1–15的精确效力排名。结构意见同时考虑暴露程度、局部包装、主链构象、极性/电荷变化、二硫键邻近和潜在化学责任。溶解度与热稳定性判断是结合结构机制与预测方向形成的专家假设，不是实测结果。</w:t>
-      </w:r>
-    </w:p>
-    <w:p>
-      <w:pPr>
-        <w:pStyle w:val="Heading2"/>
-      </w:pPr>
-      <w:r>
-        <w:t>7.1 展示顺序1–8</w:t>
+        <w:t>“父单突”是指获准作为双突组成部分的单突。下表按固定展示顺序列出15条父单突；顺序用于交付与追溯，不是1–15的精确效力排名。结构意见同时考虑暴露程度、局部包装、主链构象、极性/电荷变化、二硫键邻近和潜在化学风险。溶解度与热稳定性判断是结合结构机制与预测方向形成的专家假设，不是实测结果。</w:t>
       </w:r>
     </w:p>
     <w:tbl>
@@ -5533,286 +6083,6 @@
                 <w:sz w:val="14"/>
               </w:rPr>
               <w:t>S中等改善；实验坐标缺失，保留为CDR1极性化假设。</w:t>
-            </w:r>
-          </w:p>
-        </w:tc>
-      </w:tr>
-    </w:tbl>
-    <w:p>
-      <w:pPr>
-        <w:pStyle w:val="Heading2"/>
-      </w:pPr>
-      <w:r>
-        <w:t>7.2 展示顺序9–15</w:t>
-      </w:r>
-    </w:p>
-    <w:tbl>
-      <w:tblPr>
-        <w:tblW w:type="dxa" w:w="9500"/>
-        <w:jc w:val="center"/>
-        <w:tblLayout w:type="fixed"/>
-        <w:tblLook w:firstColumn="1" w:firstRow="1" w:lastColumn="0" w:lastRow="0" w:noHBand="0" w:noVBand="1" w:val="04A0"/>
-        <w:tblBorders>
-          <w:top w:val="single" w:sz="12" w:color="000000" w:space="0"/>
-          <w:bottom w:val="single" w:sz="12" w:color="000000" w:space="0"/>
-          <w:left w:val="nil" w:sz="0" w:color="000000" w:space="0"/>
-          <w:right w:val="nil" w:sz="0" w:color="000000" w:space="0"/>
-          <w:insideH w:val="nil" w:sz="0" w:color="000000" w:space="0"/>
-          <w:insideV w:val="nil" w:sz="0" w:color="000000" w:space="0"/>
-        </w:tblBorders>
-      </w:tblPr>
-      <w:tblGrid>
-        <w:gridCol w:w="445"/>
-        <w:gridCol w:w="725"/>
-        <w:gridCol w:w="655"/>
-        <w:gridCol w:w="959"/>
-        <w:gridCol w:w="959"/>
-        <w:gridCol w:w="1076"/>
-        <w:gridCol w:w="1696"/>
-        <w:gridCol w:w="2985"/>
-      </w:tblGrid>
-      <w:tr>
-        <w:trPr>
-          <w:tblHeader w:val="true"/>
-          <w:cantSplit/>
-        </w:trPr>
-        <w:tc>
-          <w:tcPr>
-            <w:tcW w:type="dxa" w:w="445"/>
-            <w:vAlign w:val="center"/>
-            <w:tcMar>
-              <w:top w:w="70" w:type="dxa"/>
-              <w:bottom w:w="70" w:type="dxa"/>
-              <w:start w:w="95" w:type="dxa"/>
-              <w:end w:w="95" w:type="dxa"/>
-            </w:tcMar>
-            <w:tcBorders>
-              <w:bottom w:val="single" w:sz="8" w:color="000000" w:space="0"/>
-            </w:tcBorders>
-          </w:tcPr>
-          <w:p>
-            <w:pPr>
-              <w:spacing w:after="0" w:line="247" w:lineRule="auto"/>
-            </w:pPr>
-            <w:r/>
-            <w:r>
-              <w:rPr>
-                <w:rFonts w:ascii="Microsoft YaHei" w:hAnsi="Microsoft YaHei" w:eastAsia="Microsoft YaHei" w:cs="Microsoft YaHei"/>
-                <w:b/>
-                <w:color w:val="000000"/>
-                <w:sz w:val="14"/>
-              </w:rPr>
-              <w:t>序</w:t>
-            </w:r>
-          </w:p>
-        </w:tc>
-        <w:tc>
-          <w:tcPr>
-            <w:tcW w:type="dxa" w:w="725"/>
-            <w:vAlign w:val="center"/>
-            <w:tcMar>
-              <w:top w:w="70" w:type="dxa"/>
-              <w:bottom w:w="70" w:type="dxa"/>
-              <w:start w:w="95" w:type="dxa"/>
-              <w:end w:w="95" w:type="dxa"/>
-            </w:tcMar>
-            <w:tcBorders>
-              <w:bottom w:val="single" w:sz="8" w:color="000000" w:space="0"/>
-            </w:tcBorders>
-          </w:tcPr>
-          <w:p>
-            <w:pPr>
-              <w:spacing w:after="0" w:line="247" w:lineRule="auto"/>
-            </w:pPr>
-            <w:r/>
-            <w:r>
-              <w:rPr>
-                <w:rFonts w:ascii="Microsoft YaHei" w:hAnsi="Microsoft YaHei" w:eastAsia="Microsoft YaHei" w:cs="Microsoft YaHei"/>
-                <w:b/>
-                <w:color w:val="000000"/>
-                <w:sz w:val="14"/>
-              </w:rPr>
-              <w:t>单突</w:t>
-            </w:r>
-          </w:p>
-        </w:tc>
-        <w:tc>
-          <w:tcPr>
-            <w:tcW w:type="dxa" w:w="655"/>
-            <w:vAlign w:val="center"/>
-            <w:tcMar>
-              <w:top w:w="70" w:type="dxa"/>
-              <w:bottom w:w="70" w:type="dxa"/>
-              <w:start w:w="95" w:type="dxa"/>
-              <w:end w:w="95" w:type="dxa"/>
-            </w:tcMar>
-            <w:tcBorders>
-              <w:bottom w:val="single" w:sz="8" w:color="000000" w:space="0"/>
-            </w:tcBorders>
-          </w:tcPr>
-          <w:p>
-            <w:pPr>
-              <w:spacing w:after="0" w:line="247" w:lineRule="auto"/>
-            </w:pPr>
-            <w:r/>
-            <w:r>
-              <w:rPr>
-                <w:rFonts w:ascii="Microsoft YaHei" w:hAnsi="Microsoft YaHei" w:eastAsia="Microsoft YaHei" w:cs="Microsoft YaHei"/>
-                <w:b/>
-                <w:color w:val="000000"/>
-                <w:sz w:val="14"/>
-              </w:rPr>
-              <w:t>区域</w:t>
-            </w:r>
-          </w:p>
-        </w:tc>
-        <w:tc>
-          <w:tcPr>
-            <w:tcW w:type="dxa" w:w="959"/>
-            <w:vAlign w:val="center"/>
-            <w:tcMar>
-              <w:top w:w="70" w:type="dxa"/>
-              <w:bottom w:w="70" w:type="dxa"/>
-              <w:start w:w="95" w:type="dxa"/>
-              <w:end w:w="95" w:type="dxa"/>
-            </w:tcMar>
-            <w:tcBorders>
-              <w:bottom w:val="single" w:sz="8" w:color="000000" w:space="0"/>
-            </w:tcBorders>
-          </w:tcPr>
-          <w:p>
-            <w:pPr>
-              <w:spacing w:after="0" w:line="247" w:lineRule="auto"/>
-            </w:pPr>
-            <w:r/>
-            <w:r>
-              <w:rPr>
-                <w:rFonts w:ascii="Microsoft YaHei" w:hAnsi="Microsoft YaHei" w:eastAsia="Microsoft YaHei" w:cs="Microsoft YaHei"/>
-                <w:b/>
-                <w:color w:val="000000"/>
-                <w:sz w:val="14"/>
-              </w:rPr>
-              <w:t>ΔU</w:t>
-            </w:r>
-          </w:p>
-        </w:tc>
-        <w:tc>
-          <w:tcPr>
-            <w:tcW w:type="dxa" w:w="959"/>
-            <w:vAlign w:val="center"/>
-            <w:tcMar>
-              <w:top w:w="70" w:type="dxa"/>
-              <w:bottom w:w="70" w:type="dxa"/>
-              <w:start w:w="95" w:type="dxa"/>
-              <w:end w:w="95" w:type="dxa"/>
-            </w:tcMar>
-            <w:tcBorders>
-              <w:bottom w:val="single" w:sz="8" w:color="000000" w:space="0"/>
-            </w:tcBorders>
-          </w:tcPr>
-          <w:p>
-            <w:pPr>
-              <w:spacing w:after="0" w:line="247" w:lineRule="auto"/>
-            </w:pPr>
-            <w:r/>
-            <w:r>
-              <w:rPr>
-                <w:rFonts w:ascii="Microsoft YaHei" w:hAnsi="Microsoft YaHei" w:eastAsia="Microsoft YaHei" w:cs="Microsoft YaHei"/>
-                <w:b/>
-                <w:color w:val="000000"/>
-                <w:sz w:val="14"/>
-              </w:rPr>
-              <w:t>ΔS</w:t>
-            </w:r>
-          </w:p>
-        </w:tc>
-        <w:tc>
-          <w:tcPr>
-            <w:tcW w:type="dxa" w:w="1076"/>
-            <w:vAlign w:val="center"/>
-            <w:tcMar>
-              <w:top w:w="70" w:type="dxa"/>
-              <w:bottom w:w="70" w:type="dxa"/>
-              <w:start w:w="95" w:type="dxa"/>
-              <w:end w:w="95" w:type="dxa"/>
-            </w:tcMar>
-            <w:tcBorders>
-              <w:bottom w:val="single" w:sz="8" w:color="000000" w:space="0"/>
-            </w:tcBorders>
-          </w:tcPr>
-          <w:p>
-            <w:pPr>
-              <w:spacing w:after="0" w:line="247" w:lineRule="auto"/>
-            </w:pPr>
-            <w:r/>
-            <w:r>
-              <w:rPr>
-                <w:rFonts w:ascii="Microsoft YaHei" w:hAnsi="Microsoft YaHei" w:eastAsia="Microsoft YaHei" w:cs="Microsoft YaHei"/>
-                <w:b/>
-                <w:color w:val="000000"/>
-                <w:sz w:val="14"/>
-              </w:rPr>
-              <w:t>ΔTm</w:t>
-            </w:r>
-          </w:p>
-        </w:tc>
-        <w:tc>
-          <w:tcPr>
-            <w:tcW w:type="dxa" w:w="1696"/>
-            <w:vAlign w:val="center"/>
-            <w:tcMar>
-              <w:top w:w="70" w:type="dxa"/>
-              <w:bottom w:w="70" w:type="dxa"/>
-              <w:start w:w="95" w:type="dxa"/>
-              <w:end w:w="95" w:type="dxa"/>
-            </w:tcMar>
-            <w:tcBorders>
-              <w:bottom w:val="single" w:sz="8" w:color="000000" w:space="0"/>
-            </w:tcBorders>
-          </w:tcPr>
-          <w:p>
-            <w:pPr>
-              <w:spacing w:after="0" w:line="247" w:lineRule="auto"/>
-            </w:pPr>
-            <w:r/>
-            <w:r>
-              <w:rPr>
-                <w:rFonts w:ascii="Microsoft YaHei" w:hAnsi="Microsoft YaHei" w:eastAsia="Microsoft YaHei" w:cs="Microsoft YaHei"/>
-                <w:b/>
-                <w:color w:val="000000"/>
-                <w:sz w:val="14"/>
-              </w:rPr>
-              <w:t>结构证据/判断</w:t>
-            </w:r>
-          </w:p>
-        </w:tc>
-        <w:tc>
-          <w:tcPr>
-            <w:tcW w:type="dxa" w:w="2985"/>
-            <w:vAlign w:val="center"/>
-            <w:tcMar>
-              <w:top w:w="70" w:type="dxa"/>
-              <w:bottom w:w="70" w:type="dxa"/>
-              <w:start w:w="95" w:type="dxa"/>
-              <w:end w:w="95" w:type="dxa"/>
-            </w:tcMar>
-            <w:tcBorders>
-              <w:bottom w:val="single" w:sz="8" w:color="000000" w:space="0"/>
-            </w:tcBorders>
-          </w:tcPr>
-          <w:p>
-            <w:pPr>
-              <w:spacing w:after="0" w:line="247" w:lineRule="auto"/>
-            </w:pPr>
-            <w:r/>
-            <w:r>
-              <w:rPr>
-                <w:rFonts w:ascii="Microsoft YaHei" w:hAnsi="Microsoft YaHei" w:eastAsia="Microsoft YaHei" w:cs="Microsoft YaHei"/>
-                <w:b/>
-                <w:color w:val="000000"/>
-                <w:sz w:val="14"/>
-              </w:rPr>
-              <w:t>入选依据与风险</w:t>
             </w:r>
           </w:p>
         </w:tc>
@@ -7598,15 +7868,7 @@
           <w:rFonts w:ascii="Microsoft YaHei" w:hAnsi="Microsoft YaHei" w:eastAsia="Microsoft YaHei" w:cs="Microsoft YaHei"/>
           <w:color w:val="000000"/>
         </w:rPr>
-        <w:t>双突入选综合考虑性质幅度档、组成单突专家意见、完整序列化学责任、WT位点空间关系和组合多样性。该过程是显式人工复核后的实验面板选择，不声称由唯一优化函数得到全局最优。</w:t>
-      </w:r>
-    </w:p>
-    <w:p>
-      <w:pPr>
-        <w:pStyle w:val="Heading2"/>
-      </w:pPr>
-      <w:r>
-        <w:t>9.1 展示顺序1–8</w:t>
+        <w:t>双突入选综合考虑性质幅度档、组成单突专家意见、完整序列潜在化学风险、WT位点空间关系和组合多样性。该过程是显式人工复核后的实验面板选择，不声称由唯一优化函数得到全局最优。</w:t>
       </w:r>
     </w:p>
     <w:tbl>
@@ -7845,7 +8107,7 @@
                 <w:color w:val="000000"/>
                 <w:sz w:val="14"/>
               </w:rPr>
-              <w:t>结构/责任</w:t>
+              <w:t>结构证据/风险</w:t>
             </w:r>
           </w:p>
         </w:tc>
@@ -8077,7 +8339,7 @@
               </w:rPr>
               <w:t>实验复合物</w:t>
               <w:br/>
-              <w:t>未记录潜在化学责任</w:t>
+              <w:t>未记录额外化学风险</w:t>
             </w:r>
           </w:p>
         </w:tc>
@@ -8306,7 +8568,7 @@
               </w:rPr>
               <w:t>实验复合物</w:t>
               <w:br/>
-              <w:t>未记录潜在化学责任</w:t>
+              <w:t>未记录额外化学风险</w:t>
             </w:r>
           </w:p>
         </w:tc>
@@ -8535,7 +8797,7 @@
               </w:rPr>
               <w:t>实验复合物</w:t>
               <w:br/>
-              <w:t>未记录潜在化学责任</w:t>
+              <w:t>未记录额外化学风险</w:t>
             </w:r>
           </w:p>
         </w:tc>
@@ -8764,7 +9026,7 @@
               </w:rPr>
               <w:t>AF3补充上下文</w:t>
               <w:br/>
-              <w:t>未记录潜在化学责任</w:t>
+              <w:t>未记录额外化学风险</w:t>
             </w:r>
           </w:p>
         </w:tc>
@@ -9451,7 +9713,7 @@
               </w:rPr>
               <w:t>实验复合物</w:t>
               <w:br/>
-              <w:t>未记录潜在化学责任</w:t>
+              <w:t>未记录额外化学风险</w:t>
             </w:r>
           </w:p>
         </w:tc>
@@ -9680,7 +9942,7 @@
               </w:rPr>
               <w:t>实验复合物</w:t>
               <w:br/>
-              <w:t>未记录潜在化学责任</w:t>
+              <w:t>未记录额外化学风险</w:t>
             </w:r>
           </w:p>
         </w:tc>
@@ -9708,286 +9970,6 @@
                 <w:sz w:val="14"/>
               </w:rPr>
               <w:t>两个远距外露框架位点的电荷/极性调整，S与Tm均显著有利。</w:t>
-            </w:r>
-          </w:p>
-        </w:tc>
-      </w:tr>
-    </w:tbl>
-    <w:p>
-      <w:pPr>
-        <w:pStyle w:val="Heading2"/>
-      </w:pPr>
-      <w:r>
-        <w:t>9.2 展示顺序9–15</w:t>
-      </w:r>
-    </w:p>
-    <w:tbl>
-      <w:tblPr>
-        <w:tblW w:type="dxa" w:w="9500"/>
-        <w:jc w:val="center"/>
-        <w:tblLayout w:type="fixed"/>
-        <w:tblLook w:firstColumn="1" w:firstRow="1" w:lastColumn="0" w:lastRow="0" w:noHBand="0" w:noVBand="1" w:val="04A0"/>
-        <w:tblBorders>
-          <w:top w:val="single" w:sz="12" w:color="000000" w:space="0"/>
-          <w:bottom w:val="single" w:sz="12" w:color="000000" w:space="0"/>
-          <w:left w:val="nil" w:sz="0" w:color="000000" w:space="0"/>
-          <w:right w:val="nil" w:sz="0" w:color="000000" w:space="0"/>
-          <w:insideH w:val="nil" w:sz="0" w:color="000000" w:space="0"/>
-          <w:insideV w:val="nil" w:sz="0" w:color="000000" w:space="0"/>
-        </w:tblBorders>
-      </w:tblPr>
-      <w:tblGrid>
-        <w:gridCol w:w="425"/>
-        <w:gridCol w:w="1174"/>
-        <w:gridCol w:w="961"/>
-        <w:gridCol w:w="872"/>
-        <w:gridCol w:w="872"/>
-        <w:gridCol w:w="1006"/>
-        <w:gridCol w:w="1587"/>
-        <w:gridCol w:w="2603"/>
-      </w:tblGrid>
-      <w:tr>
-        <w:trPr>
-          <w:tblHeader w:val="true"/>
-          <w:cantSplit/>
-        </w:trPr>
-        <w:tc>
-          <w:tcPr>
-            <w:tcW w:type="dxa" w:w="425"/>
-            <w:vAlign w:val="center"/>
-            <w:tcMar>
-              <w:top w:w="70" w:type="dxa"/>
-              <w:bottom w:w="70" w:type="dxa"/>
-              <w:start w:w="95" w:type="dxa"/>
-              <w:end w:w="95" w:type="dxa"/>
-            </w:tcMar>
-            <w:tcBorders>
-              <w:bottom w:val="single" w:sz="8" w:color="000000" w:space="0"/>
-            </w:tcBorders>
-          </w:tcPr>
-          <w:p>
-            <w:pPr>
-              <w:spacing w:after="0" w:line="247" w:lineRule="auto"/>
-            </w:pPr>
-            <w:r/>
-            <w:r>
-              <w:rPr>
-                <w:rFonts w:ascii="Microsoft YaHei" w:hAnsi="Microsoft YaHei" w:eastAsia="Microsoft YaHei" w:cs="Microsoft YaHei"/>
-                <w:b/>
-                <w:color w:val="000000"/>
-                <w:sz w:val="14"/>
-              </w:rPr>
-              <w:t>序</w:t>
-            </w:r>
-          </w:p>
-        </w:tc>
-        <w:tc>
-          <w:tcPr>
-            <w:tcW w:type="dxa" w:w="1174"/>
-            <w:vAlign w:val="center"/>
-            <w:tcMar>
-              <w:top w:w="70" w:type="dxa"/>
-              <w:bottom w:w="70" w:type="dxa"/>
-              <w:start w:w="95" w:type="dxa"/>
-              <w:end w:w="95" w:type="dxa"/>
-            </w:tcMar>
-            <w:tcBorders>
-              <w:bottom w:val="single" w:sz="8" w:color="000000" w:space="0"/>
-            </w:tcBorders>
-          </w:tcPr>
-          <w:p>
-            <w:pPr>
-              <w:spacing w:after="0" w:line="247" w:lineRule="auto"/>
-            </w:pPr>
-            <w:r/>
-            <w:r>
-              <w:rPr>
-                <w:rFonts w:ascii="Microsoft YaHei" w:hAnsi="Microsoft YaHei" w:eastAsia="Microsoft YaHei" w:cs="Microsoft YaHei"/>
-                <w:b/>
-                <w:color w:val="000000"/>
-                <w:sz w:val="14"/>
-              </w:rPr>
-              <w:t>双突</w:t>
-            </w:r>
-          </w:p>
-        </w:tc>
-        <w:tc>
-          <w:tcPr>
-            <w:tcW w:type="dxa" w:w="961"/>
-            <w:vAlign w:val="center"/>
-            <w:tcMar>
-              <w:top w:w="70" w:type="dxa"/>
-              <w:bottom w:w="70" w:type="dxa"/>
-              <w:start w:w="95" w:type="dxa"/>
-              <w:end w:w="95" w:type="dxa"/>
-            </w:tcMar>
-            <w:tcBorders>
-              <w:bottom w:val="single" w:sz="8" w:color="000000" w:space="0"/>
-            </w:tcBorders>
-          </w:tcPr>
-          <w:p>
-            <w:pPr>
-              <w:spacing w:after="0" w:line="247" w:lineRule="auto"/>
-            </w:pPr>
-            <w:r/>
-            <w:r>
-              <w:rPr>
-                <w:rFonts w:ascii="Microsoft YaHei" w:hAnsi="Microsoft YaHei" w:eastAsia="Microsoft YaHei" w:cs="Microsoft YaHei"/>
-                <w:b/>
-                <w:color w:val="000000"/>
-                <w:sz w:val="14"/>
-              </w:rPr>
-              <w:t>区域</w:t>
-            </w:r>
-          </w:p>
-        </w:tc>
-        <w:tc>
-          <w:tcPr>
-            <w:tcW w:type="dxa" w:w="872"/>
-            <w:vAlign w:val="center"/>
-            <w:tcMar>
-              <w:top w:w="70" w:type="dxa"/>
-              <w:bottom w:w="70" w:type="dxa"/>
-              <w:start w:w="95" w:type="dxa"/>
-              <w:end w:w="95" w:type="dxa"/>
-            </w:tcMar>
-            <w:tcBorders>
-              <w:bottom w:val="single" w:sz="8" w:color="000000" w:space="0"/>
-            </w:tcBorders>
-          </w:tcPr>
-          <w:p>
-            <w:pPr>
-              <w:spacing w:after="0" w:line="247" w:lineRule="auto"/>
-            </w:pPr>
-            <w:r/>
-            <w:r>
-              <w:rPr>
-                <w:rFonts w:ascii="Microsoft YaHei" w:hAnsi="Microsoft YaHei" w:eastAsia="Microsoft YaHei" w:cs="Microsoft YaHei"/>
-                <w:b/>
-                <w:color w:val="000000"/>
-                <w:sz w:val="14"/>
-              </w:rPr>
-              <w:t>ΔU</w:t>
-            </w:r>
-          </w:p>
-        </w:tc>
-        <w:tc>
-          <w:tcPr>
-            <w:tcW w:type="dxa" w:w="872"/>
-            <w:vAlign w:val="center"/>
-            <w:tcMar>
-              <w:top w:w="70" w:type="dxa"/>
-              <w:bottom w:w="70" w:type="dxa"/>
-              <w:start w:w="95" w:type="dxa"/>
-              <w:end w:w="95" w:type="dxa"/>
-            </w:tcMar>
-            <w:tcBorders>
-              <w:bottom w:val="single" w:sz="8" w:color="000000" w:space="0"/>
-            </w:tcBorders>
-          </w:tcPr>
-          <w:p>
-            <w:pPr>
-              <w:spacing w:after="0" w:line="247" w:lineRule="auto"/>
-            </w:pPr>
-            <w:r/>
-            <w:r>
-              <w:rPr>
-                <w:rFonts w:ascii="Microsoft YaHei" w:hAnsi="Microsoft YaHei" w:eastAsia="Microsoft YaHei" w:cs="Microsoft YaHei"/>
-                <w:b/>
-                <w:color w:val="000000"/>
-                <w:sz w:val="14"/>
-              </w:rPr>
-              <w:t>ΔS</w:t>
-            </w:r>
-          </w:p>
-        </w:tc>
-        <w:tc>
-          <w:tcPr>
-            <w:tcW w:type="dxa" w:w="1006"/>
-            <w:vAlign w:val="center"/>
-            <w:tcMar>
-              <w:top w:w="70" w:type="dxa"/>
-              <w:bottom w:w="70" w:type="dxa"/>
-              <w:start w:w="95" w:type="dxa"/>
-              <w:end w:w="95" w:type="dxa"/>
-            </w:tcMar>
-            <w:tcBorders>
-              <w:bottom w:val="single" w:sz="8" w:color="000000" w:space="0"/>
-            </w:tcBorders>
-          </w:tcPr>
-          <w:p>
-            <w:pPr>
-              <w:spacing w:after="0" w:line="247" w:lineRule="auto"/>
-            </w:pPr>
-            <w:r/>
-            <w:r>
-              <w:rPr>
-                <w:rFonts w:ascii="Microsoft YaHei" w:hAnsi="Microsoft YaHei" w:eastAsia="Microsoft YaHei" w:cs="Microsoft YaHei"/>
-                <w:b/>
-                <w:color w:val="000000"/>
-                <w:sz w:val="14"/>
-              </w:rPr>
-              <w:t>ΔTm</w:t>
-            </w:r>
-          </w:p>
-        </w:tc>
-        <w:tc>
-          <w:tcPr>
-            <w:tcW w:type="dxa" w:w="1587"/>
-            <w:vAlign w:val="center"/>
-            <w:tcMar>
-              <w:top w:w="70" w:type="dxa"/>
-              <w:bottom w:w="70" w:type="dxa"/>
-              <w:start w:w="95" w:type="dxa"/>
-              <w:end w:w="95" w:type="dxa"/>
-            </w:tcMar>
-            <w:tcBorders>
-              <w:bottom w:val="single" w:sz="8" w:color="000000" w:space="0"/>
-            </w:tcBorders>
-          </w:tcPr>
-          <w:p>
-            <w:pPr>
-              <w:spacing w:after="0" w:line="247" w:lineRule="auto"/>
-            </w:pPr>
-            <w:r/>
-            <w:r>
-              <w:rPr>
-                <w:rFonts w:ascii="Microsoft YaHei" w:hAnsi="Microsoft YaHei" w:eastAsia="Microsoft YaHei" w:cs="Microsoft YaHei"/>
-                <w:b/>
-                <w:color w:val="000000"/>
-                <w:sz w:val="14"/>
-              </w:rPr>
-              <w:t>结构/责任</w:t>
-            </w:r>
-          </w:p>
-        </w:tc>
-        <w:tc>
-          <w:tcPr>
-            <w:tcW w:type="dxa" w:w="2603"/>
-            <w:vAlign w:val="center"/>
-            <w:tcMar>
-              <w:top w:w="70" w:type="dxa"/>
-              <w:bottom w:w="70" w:type="dxa"/>
-              <w:start w:w="95" w:type="dxa"/>
-              <w:end w:w="95" w:type="dxa"/>
-            </w:tcMar>
-            <w:tcBorders>
-              <w:bottom w:val="single" w:sz="8" w:color="000000" w:space="0"/>
-            </w:tcBorders>
-          </w:tcPr>
-          <w:p>
-            <w:pPr>
-              <w:spacing w:after="0" w:line="247" w:lineRule="auto"/>
-            </w:pPr>
-            <w:r/>
-            <w:r>
-              <w:rPr>
-                <w:rFonts w:ascii="Microsoft YaHei" w:hAnsi="Microsoft YaHei" w:eastAsia="Microsoft YaHei" w:cs="Microsoft YaHei"/>
-                <w:b/>
-                <w:color w:val="000000"/>
-                <w:sz w:val="14"/>
-              </w:rPr>
-              <w:t>入选依据</w:t>
             </w:r>
           </w:p>
         </w:tc>
@@ -10189,7 +10171,7 @@
               </w:rPr>
               <w:t>实验复合物</w:t>
               <w:br/>
-              <w:t>未记录潜在化学责任</w:t>
+              <w:t>未记录额外化学风险</w:t>
             </w:r>
           </w:p>
         </w:tc>
@@ -10418,7 +10400,7 @@
               </w:rPr>
               <w:t>实验复合物</w:t>
               <w:br/>
-              <w:t>未记录潜在化学责任</w:t>
+              <w:t>未记录额外化学风险</w:t>
             </w:r>
           </w:p>
         </w:tc>
@@ -10647,7 +10629,7 @@
               </w:rPr>
               <w:t>实验复合物</w:t>
               <w:br/>
-              <w:t>未记录潜在化学责任</w:t>
+              <w:t>未记录额外化学风险</w:t>
             </w:r>
           </w:p>
         </w:tc>
@@ -10876,7 +10858,7 @@
               </w:rPr>
               <w:t>AF3补充上下文</w:t>
               <w:br/>
-              <w:t>未记录潜在化学责任</w:t>
+              <w:t>未记录额外化学风险</w:t>
             </w:r>
           </w:p>
         </w:tc>
@@ -11105,7 +11087,7 @@
               </w:rPr>
               <w:t>实验复合物</w:t>
               <w:br/>
-              <w:t>未记录潜在化学责任</w:t>
+              <w:t>未记录额外化学风险</w:t>
             </w:r>
           </w:p>
         </w:tc>
@@ -11334,7 +11316,7 @@
               </w:rPr>
               <w:t>AF3补充上下文</w:t>
               <w:br/>
-              <w:t>未记录潜在化学责任</w:t>
+              <w:t>未记录额外化学风险</w:t>
             </w:r>
           </w:p>
         </w:tc>
@@ -11563,7 +11545,7 @@
               </w:rPr>
               <w:t>实验复合物</w:t>
               <w:br/>
-              <w:t>未记录潜在化学责任</w:t>
+              <w:t>未记录额外化学风险</w:t>
             </w:r>
           </w:p>
         </w:tc>
@@ -11617,6 +11599,7 @@
     <w:p>
       <w:pPr>
         <w:pStyle w:val="Heading2"/>
+        <w:pageBreakBefore w:val="0"/>
       </w:pPr>
       <w:r>
         <w:t>10.1 单突（15条）</w:t>
@@ -13904,6 +13887,7 @@
     <w:p>
       <w:pPr>
         <w:pStyle w:val="Heading2"/>
+        <w:pageBreakBefore w:val="0"/>
       </w:pPr>
       <w:r>
         <w:t>10.2 双突（15条）</w:t>
@@ -16521,7 +16505,7 @@
                 <w:color w:val="000000"/>
                 <w:sz w:val="16"/>
               </w:rPr>
-              <w:t>新增脱酰胺责任</w:t>
+              <w:t>新增脱酰胺风险</w:t>
             </w:r>
           </w:p>
         </w:tc>
@@ -16575,7 +16559,7 @@
                 <w:color w:val="000000"/>
                 <w:sz w:val="16"/>
               </w:rPr>
-              <w:t>新增reported 30的NG基序；需在表达、储存和纯化条件下监测。</w:t>
+              <w:t>新增reported 30的NG基序，可能增加脱酰胺敏感性。</w:t>
             </w:r>
           </w:p>
         </w:tc>
@@ -16661,7 +16645,7 @@
                 <w:color w:val="000000"/>
                 <w:sz w:val="16"/>
               </w:rPr>
-              <w:t>增加一个Met氧化敏感残基；应配合氧化状态与单体质量质控。</w:t>
+              <w:t>增加一个Met氧化敏感残基，可能提高储存或处理过程中的氧化风险。</w:t>
             </w:r>
           </w:p>
         </w:tc>
@@ -17091,7 +17075,7 @@
                 <w:color w:val="000000"/>
                 <w:sz w:val="16"/>
               </w:rPr>
-              <w:t>24个直接界面位点未突变，但非界面/CDR构象变化仍可能间接影响结合；需实验QC。</w:t>
+              <w:t>24个直接界面位点未突变，但非界面/CDR构象变化仍可能间接影响结合；当前尚未验证结合保持。</w:t>
             </w:r>
           </w:p>
         </w:tc>
@@ -17100,6 +17084,7 @@
     <w:p>
       <w:pPr>
         <w:pStyle w:val="Heading2"/>
+        <w:pageBreakBefore/>
       </w:pPr>
       <w:r>
         <w:t>预测与审计边界</w:t>
@@ -17162,7 +17147,7 @@
           <w:rFonts w:ascii="Microsoft YaHei" w:hAnsi="Microsoft YaHei" w:eastAsia="Microsoft YaHei" w:cs="Microsoft YaHei"/>
           <w:color w:val="000000"/>
         </w:rPr>
-        <w:t>仓库中的派生双突矩阵与身份哈希已通过审计，但远程原始紧凑评分表未随本地仓库归档，当前本地无法从最原始103行输出独立重建联接。</w:t>
+        <w:t>用于本报告的双突结果矩阵已经过候选身份与序列一致性检查；但远程运行的最原始103行紧凑评分表未随本地报告材料归档，因此无法仅凭当前本地材料从原始输出重新构建该矩阵。</w:t>
       </w:r>
     </w:p>
     <w:p>
@@ -17172,666 +17157,6 @@
           <w:color w:val="000000"/>
         </w:rPr>
         <w:t>独立审计未发现序列错配、突变重建错误、冻结位点违规或最终CSV/FASTA不一致；总判定为可继续实验准备，但需保留上述科学与溯源限制。详细审计与本报告置于同一V3报告目录。</w:t>
-      </w:r>
-    </w:p>
-    <w:p>
-      <w:pPr>
-        <w:pStyle w:val="Heading1"/>
-        <w:pageBreakBefore w:val="0"/>
-      </w:pPr>
-      <w:r>
-        <w:t>12. 实验验证建议</w:t>
-      </w:r>
-    </w:p>
-    <w:p>
-      <w:r>
-        <w:rPr>
-          <w:rFonts w:ascii="Microsoft YaHei" w:hAnsi="Microsoft YaHei" w:eastAsia="Microsoft YaHei" w:cs="Microsoft YaHei"/>
-          <w:color w:val="000000"/>
-        </w:rPr>
-        <w:t>建议以WT与30条候选为同批对照体系，保持载体、信号肽、标签、菌株、培养基、诱导条件、采样时间和纯化流程一致。若实验容量有限，可按单突/双突分批，但每批均保留WT和跨批桥接对照。</w:t>
-      </w:r>
-    </w:p>
-    <w:tbl>
-      <w:tblPr>
-        <w:tblW w:type="dxa" w:w="9500"/>
-        <w:jc w:val="center"/>
-        <w:tblLayout w:type="fixed"/>
-        <w:tblLook w:firstColumn="1" w:firstRow="1" w:lastColumn="0" w:lastRow="0" w:noHBand="0" w:noVBand="1" w:val="04A0"/>
-        <w:tblBorders>
-          <w:top w:val="single" w:sz="12" w:color="000000" w:space="0"/>
-          <w:bottom w:val="single" w:sz="12" w:color="000000" w:space="0"/>
-          <w:left w:val="nil" w:sz="0" w:color="000000" w:space="0"/>
-          <w:right w:val="nil" w:sz="0" w:color="000000" w:space="0"/>
-          <w:insideH w:val="nil" w:sz="0" w:color="000000" w:space="0"/>
-          <w:insideV w:val="nil" w:sz="0" w:color="000000" w:space="0"/>
-        </w:tblBorders>
-      </w:tblPr>
-      <w:tblGrid>
-        <w:gridCol w:w="1743"/>
-        <w:gridCol w:w="3661"/>
-        <w:gridCol w:w="4096"/>
-      </w:tblGrid>
-      <w:tr>
-        <w:trPr>
-          <w:tblHeader w:val="true"/>
-          <w:cantSplit/>
-        </w:trPr>
-        <w:tc>
-          <w:tcPr>
-            <w:tcW w:type="dxa" w:w="1743"/>
-            <w:vAlign w:val="center"/>
-            <w:tcMar>
-              <w:top w:w="70" w:type="dxa"/>
-              <w:bottom w:w="70" w:type="dxa"/>
-              <w:start w:w="95" w:type="dxa"/>
-              <w:end w:w="95" w:type="dxa"/>
-            </w:tcMar>
-            <w:tcBorders>
-              <w:bottom w:val="single" w:sz="8" w:color="000000" w:space="0"/>
-            </w:tcBorders>
-          </w:tcPr>
-          <w:p>
-            <w:pPr>
-              <w:spacing w:after="0" w:line="247" w:lineRule="auto"/>
-            </w:pPr>
-            <w:r/>
-            <w:r>
-              <w:rPr>
-                <w:rFonts w:ascii="Microsoft YaHei" w:hAnsi="Microsoft YaHei" w:eastAsia="Microsoft YaHei" w:cs="Microsoft YaHei"/>
-                <w:b/>
-                <w:color w:val="000000"/>
-                <w:sz w:val="17"/>
-              </w:rPr>
-              <w:t>层级</w:t>
-            </w:r>
-          </w:p>
-        </w:tc>
-        <w:tc>
-          <w:tcPr>
-            <w:tcW w:type="dxa" w:w="3661"/>
-            <w:vAlign w:val="center"/>
-            <w:tcMar>
-              <w:top w:w="70" w:type="dxa"/>
-              <w:bottom w:w="70" w:type="dxa"/>
-              <w:start w:w="95" w:type="dxa"/>
-              <w:end w:w="95" w:type="dxa"/>
-            </w:tcMar>
-            <w:tcBorders>
-              <w:bottom w:val="single" w:sz="8" w:color="000000" w:space="0"/>
-            </w:tcBorders>
-          </w:tcPr>
-          <w:p>
-            <w:pPr>
-              <w:spacing w:after="0" w:line="247" w:lineRule="auto"/>
-            </w:pPr>
-            <w:r/>
-            <w:r>
-              <w:rPr>
-                <w:rFonts w:ascii="Microsoft YaHei" w:hAnsi="Microsoft YaHei" w:eastAsia="Microsoft YaHei" w:cs="Microsoft YaHei"/>
-                <w:b/>
-                <w:color w:val="000000"/>
-                <w:sz w:val="17"/>
-              </w:rPr>
-              <w:t>建议读出</w:t>
-            </w:r>
-          </w:p>
-        </w:tc>
-        <w:tc>
-          <w:tcPr>
-            <w:tcW w:type="dxa" w:w="4096"/>
-            <w:vAlign w:val="center"/>
-            <w:tcMar>
-              <w:top w:w="70" w:type="dxa"/>
-              <w:bottom w:w="70" w:type="dxa"/>
-              <w:start w:w="95" w:type="dxa"/>
-              <w:end w:w="95" w:type="dxa"/>
-            </w:tcMar>
-            <w:tcBorders>
-              <w:bottom w:val="single" w:sz="8" w:color="000000" w:space="0"/>
-            </w:tcBorders>
-          </w:tcPr>
-          <w:p>
-            <w:pPr>
-              <w:spacing w:after="0" w:line="247" w:lineRule="auto"/>
-            </w:pPr>
-            <w:r/>
-            <w:r>
-              <w:rPr>
-                <w:rFonts w:ascii="Microsoft YaHei" w:hAnsi="Microsoft YaHei" w:eastAsia="Microsoft YaHei" w:cs="Microsoft YaHei"/>
-                <w:b/>
-                <w:color w:val="000000"/>
-                <w:sz w:val="17"/>
-              </w:rPr>
-              <w:t>目的</w:t>
-            </w:r>
-          </w:p>
-        </w:tc>
-      </w:tr>
-      <w:tr>
-        <w:trPr>
-          <w:cantSplit/>
-        </w:trPr>
-        <w:tc>
-          <w:tcPr>
-            <w:tcW w:type="dxa" w:w="1743"/>
-            <w:vAlign w:val="center"/>
-            <w:tcMar>
-              <w:top w:w="70" w:type="dxa"/>
-              <w:bottom w:w="70" w:type="dxa"/>
-              <w:start w:w="95" w:type="dxa"/>
-              <w:end w:w="95" w:type="dxa"/>
-            </w:tcMar>
-          </w:tcPr>
-          <w:p>
-            <w:pPr>
-              <w:spacing w:after="0" w:line="247" w:lineRule="auto"/>
-            </w:pPr>
-            <w:r/>
-            <w:r>
-              <w:rPr>
-                <w:rFonts w:ascii="Microsoft YaHei" w:hAnsi="Microsoft YaHei" w:eastAsia="Microsoft YaHei" w:cs="Microsoft YaHei"/>
-                <w:b w:val="0"/>
-                <w:color w:val="000000"/>
-                <w:sz w:val="17"/>
-              </w:rPr>
-              <w:t>主要终点</w:t>
-            </w:r>
-          </w:p>
-        </w:tc>
-        <w:tc>
-          <w:tcPr>
-            <w:tcW w:type="dxa" w:w="3661"/>
-            <w:vAlign w:val="center"/>
-            <w:tcMar>
-              <w:top w:w="70" w:type="dxa"/>
-              <w:bottom w:w="70" w:type="dxa"/>
-              <w:start w:w="95" w:type="dxa"/>
-              <w:end w:w="95" w:type="dxa"/>
-            </w:tcMar>
-          </w:tcPr>
-          <w:p>
-            <w:pPr>
-              <w:spacing w:after="0" w:line="247" w:lineRule="auto"/>
-            </w:pPr>
-            <w:r/>
-            <w:r>
-              <w:rPr>
-                <w:rFonts w:ascii="Microsoft YaHei" w:hAnsi="Microsoft YaHei" w:eastAsia="Microsoft YaHei" w:cs="Microsoft YaHei"/>
-                <w:b w:val="0"/>
-                <w:color w:val="000000"/>
-                <w:sz w:val="17"/>
-              </w:rPr>
-              <w:t>纯化后产量（mg/L），至少3个独立生物重复</w:t>
-            </w:r>
-          </w:p>
-        </w:tc>
-        <w:tc>
-          <w:tcPr>
-            <w:tcW w:type="dxa" w:w="4096"/>
-            <w:vAlign w:val="center"/>
-            <w:tcMar>
-              <w:top w:w="70" w:type="dxa"/>
-              <w:bottom w:w="70" w:type="dxa"/>
-              <w:start w:w="95" w:type="dxa"/>
-              <w:end w:w="95" w:type="dxa"/>
-            </w:tcMar>
-          </w:tcPr>
-          <w:p>
-            <w:pPr>
-              <w:spacing w:after="0" w:line="247" w:lineRule="auto"/>
-            </w:pPr>
-            <w:r/>
-            <w:r>
-              <w:rPr>
-                <w:rFonts w:ascii="Microsoft YaHei" w:hAnsi="Microsoft YaHei" w:eastAsia="Microsoft YaHei" w:cs="Microsoft YaHei"/>
-                <w:b w:val="0"/>
-                <w:color w:val="000000"/>
-                <w:sz w:val="17"/>
-              </w:rPr>
-              <w:t>直接回答BL21表达产量是否改善</w:t>
-            </w:r>
-          </w:p>
-        </w:tc>
-      </w:tr>
-      <w:tr>
-        <w:trPr>
-          <w:cantSplit/>
-        </w:trPr>
-        <w:tc>
-          <w:tcPr>
-            <w:tcW w:type="dxa" w:w="1743"/>
-            <w:vAlign w:val="center"/>
-            <w:tcMar>
-              <w:top w:w="70" w:type="dxa"/>
-              <w:bottom w:w="70" w:type="dxa"/>
-              <w:start w:w="95" w:type="dxa"/>
-              <w:end w:w="95" w:type="dxa"/>
-            </w:tcMar>
-          </w:tcPr>
-          <w:p>
-            <w:pPr>
-              <w:spacing w:after="0" w:line="247" w:lineRule="auto"/>
-            </w:pPr>
-            <w:r/>
-            <w:r>
-              <w:rPr>
-                <w:rFonts w:ascii="Microsoft YaHei" w:hAnsi="Microsoft YaHei" w:eastAsia="Microsoft YaHei" w:cs="Microsoft YaHei"/>
-                <w:b w:val="0"/>
-                <w:color w:val="000000"/>
-                <w:sz w:val="17"/>
-              </w:rPr>
-              <w:t>过程读出</w:t>
-            </w:r>
-          </w:p>
-        </w:tc>
-        <w:tc>
-          <w:tcPr>
-            <w:tcW w:type="dxa" w:w="3661"/>
-            <w:vAlign w:val="center"/>
-            <w:tcMar>
-              <w:top w:w="70" w:type="dxa"/>
-              <w:bottom w:w="70" w:type="dxa"/>
-              <w:start w:w="95" w:type="dxa"/>
-              <w:end w:w="95" w:type="dxa"/>
-            </w:tcMar>
-          </w:tcPr>
-          <w:p>
-            <w:pPr>
-              <w:spacing w:after="0" w:line="247" w:lineRule="auto"/>
-            </w:pPr>
-            <w:r/>
-            <w:r>
-              <w:rPr>
-                <w:rFonts w:ascii="Microsoft YaHei" w:hAnsi="Microsoft YaHei" w:eastAsia="Microsoft YaHei" w:cs="Microsoft YaHei"/>
-                <w:b w:val="0"/>
-                <w:color w:val="000000"/>
-                <w:sz w:val="17"/>
-              </w:rPr>
-              <w:t>总表达、可溶比例、纯化回收率</w:t>
-            </w:r>
-          </w:p>
-        </w:tc>
-        <w:tc>
-          <w:tcPr>
-            <w:tcW w:type="dxa" w:w="4096"/>
-            <w:vAlign w:val="center"/>
-            <w:tcMar>
-              <w:top w:w="70" w:type="dxa"/>
-              <w:bottom w:w="70" w:type="dxa"/>
-              <w:start w:w="95" w:type="dxa"/>
-              <w:end w:w="95" w:type="dxa"/>
-            </w:tcMar>
-          </w:tcPr>
-          <w:p>
-            <w:pPr>
-              <w:spacing w:after="0" w:line="247" w:lineRule="auto"/>
-            </w:pPr>
-            <w:r/>
-            <w:r>
-              <w:rPr>
-                <w:rFonts w:ascii="Microsoft YaHei" w:hAnsi="Microsoft YaHei" w:eastAsia="Microsoft YaHei" w:cs="Microsoft YaHei"/>
-                <w:b w:val="0"/>
-                <w:color w:val="000000"/>
-                <w:sz w:val="17"/>
-              </w:rPr>
-              <w:t>区分转录/表达、可溶化和纯化损失</w:t>
-            </w:r>
-          </w:p>
-        </w:tc>
-      </w:tr>
-      <w:tr>
-        <w:trPr>
-          <w:cantSplit/>
-        </w:trPr>
-        <w:tc>
-          <w:tcPr>
-            <w:tcW w:type="dxa" w:w="1743"/>
-            <w:vAlign w:val="center"/>
-            <w:tcMar>
-              <w:top w:w="70" w:type="dxa"/>
-              <w:bottom w:w="70" w:type="dxa"/>
-              <w:start w:w="95" w:type="dxa"/>
-              <w:end w:w="95" w:type="dxa"/>
-            </w:tcMar>
-          </w:tcPr>
-          <w:p>
-            <w:pPr>
-              <w:spacing w:after="0" w:line="247" w:lineRule="auto"/>
-            </w:pPr>
-            <w:r/>
-            <w:r>
-              <w:rPr>
-                <w:rFonts w:ascii="Microsoft YaHei" w:hAnsi="Microsoft YaHei" w:eastAsia="Microsoft YaHei" w:cs="Microsoft YaHei"/>
-                <w:b w:val="0"/>
-                <w:color w:val="000000"/>
-                <w:sz w:val="17"/>
-              </w:rPr>
-              <w:t>质量读出</w:t>
-            </w:r>
-          </w:p>
-        </w:tc>
-        <w:tc>
-          <w:tcPr>
-            <w:tcW w:type="dxa" w:w="3661"/>
-            <w:vAlign w:val="center"/>
-            <w:tcMar>
-              <w:top w:w="70" w:type="dxa"/>
-              <w:bottom w:w="70" w:type="dxa"/>
-              <w:start w:w="95" w:type="dxa"/>
-              <w:end w:w="95" w:type="dxa"/>
-            </w:tcMar>
-          </w:tcPr>
-          <w:p>
-            <w:pPr>
-              <w:spacing w:after="0" w:line="247" w:lineRule="auto"/>
-            </w:pPr>
-            <w:r/>
-            <w:r>
-              <w:rPr>
-                <w:rFonts w:ascii="Microsoft YaHei" w:hAnsi="Microsoft YaHei" w:eastAsia="Microsoft YaHei" w:cs="Microsoft YaHei"/>
-                <w:b w:val="0"/>
-                <w:color w:val="000000"/>
-                <w:sz w:val="17"/>
-              </w:rPr>
-              <w:t>SEC单体比例、聚集/降解、完整质量</w:t>
-            </w:r>
-          </w:p>
-        </w:tc>
-        <w:tc>
-          <w:tcPr>
-            <w:tcW w:type="dxa" w:w="4096"/>
-            <w:vAlign w:val="center"/>
-            <w:tcMar>
-              <w:top w:w="70" w:type="dxa"/>
-              <w:bottom w:w="70" w:type="dxa"/>
-              <w:start w:w="95" w:type="dxa"/>
-              <w:end w:w="95" w:type="dxa"/>
-            </w:tcMar>
-          </w:tcPr>
-          <w:p>
-            <w:pPr>
-              <w:spacing w:after="0" w:line="247" w:lineRule="auto"/>
-            </w:pPr>
-            <w:r/>
-            <w:r>
-              <w:rPr>
-                <w:rFonts w:ascii="Microsoft YaHei" w:hAnsi="Microsoft YaHei" w:eastAsia="Microsoft YaHei" w:cs="Microsoft YaHei"/>
-                <w:b w:val="0"/>
-                <w:color w:val="000000"/>
-                <w:sz w:val="17"/>
-              </w:rPr>
-              <w:t>识别高产但质量不合格的构建</w:t>
-            </w:r>
-          </w:p>
-        </w:tc>
-      </w:tr>
-      <w:tr>
-        <w:trPr>
-          <w:cantSplit/>
-        </w:trPr>
-        <w:tc>
-          <w:tcPr>
-            <w:tcW w:type="dxa" w:w="1743"/>
-            <w:vAlign w:val="center"/>
-            <w:tcMar>
-              <w:top w:w="70" w:type="dxa"/>
-              <w:bottom w:w="70" w:type="dxa"/>
-              <w:start w:w="95" w:type="dxa"/>
-              <w:end w:w="95" w:type="dxa"/>
-            </w:tcMar>
-          </w:tcPr>
-          <w:p>
-            <w:pPr>
-              <w:spacing w:after="0" w:line="247" w:lineRule="auto"/>
-            </w:pPr>
-            <w:r/>
-            <w:r>
-              <w:rPr>
-                <w:rFonts w:ascii="Microsoft YaHei" w:hAnsi="Microsoft YaHei" w:eastAsia="Microsoft YaHei" w:cs="Microsoft YaHei"/>
-                <w:b w:val="0"/>
-                <w:color w:val="000000"/>
-                <w:sz w:val="17"/>
-              </w:rPr>
-              <w:t>风险定向</w:t>
-            </w:r>
-          </w:p>
-        </w:tc>
-        <w:tc>
-          <w:tcPr>
-            <w:tcW w:type="dxa" w:w="3661"/>
-            <w:vAlign w:val="center"/>
-            <w:tcMar>
-              <w:top w:w="70" w:type="dxa"/>
-              <w:bottom w:w="70" w:type="dxa"/>
-              <w:start w:w="95" w:type="dxa"/>
-              <w:end w:w="95" w:type="dxa"/>
-            </w:tcMar>
-          </w:tcPr>
-          <w:p>
-            <w:pPr>
-              <w:spacing w:after="0" w:line="247" w:lineRule="auto"/>
-            </w:pPr>
-            <w:r/>
-            <w:r>
-              <w:rPr>
-                <w:rFonts w:ascii="Microsoft YaHei" w:hAnsi="Microsoft YaHei" w:eastAsia="Microsoft YaHei" w:cs="Microsoft YaHei"/>
-                <w:b w:val="0"/>
-                <w:color w:val="000000"/>
-                <w:sz w:val="17"/>
-              </w:rPr>
-              <w:t>F30N脱酰胺、L11M氧化、T99F/A23R结构敏感性</w:t>
-            </w:r>
-          </w:p>
-        </w:tc>
-        <w:tc>
-          <w:tcPr>
-            <w:tcW w:type="dxa" w:w="4096"/>
-            <w:vAlign w:val="center"/>
-            <w:tcMar>
-              <w:top w:w="70" w:type="dxa"/>
-              <w:bottom w:w="70" w:type="dxa"/>
-              <w:start w:w="95" w:type="dxa"/>
-              <w:end w:w="95" w:type="dxa"/>
-            </w:tcMar>
-          </w:tcPr>
-          <w:p>
-            <w:pPr>
-              <w:spacing w:after="0" w:line="247" w:lineRule="auto"/>
-            </w:pPr>
-            <w:r/>
-            <w:r>
-              <w:rPr>
-                <w:rFonts w:ascii="Microsoft YaHei" w:hAnsi="Microsoft YaHei" w:eastAsia="Microsoft YaHei" w:cs="Microsoft YaHei"/>
-                <w:b w:val="0"/>
-                <w:color w:val="000000"/>
-                <w:sz w:val="17"/>
-              </w:rPr>
-              <w:t>验证本报告记录的候选级风险</w:t>
-            </w:r>
-          </w:p>
-        </w:tc>
-      </w:tr>
-      <w:tr>
-        <w:trPr>
-          <w:cantSplit/>
-        </w:trPr>
-        <w:tc>
-          <w:tcPr>
-            <w:tcW w:type="dxa" w:w="1743"/>
-            <w:vAlign w:val="center"/>
-            <w:tcMar>
-              <w:top w:w="70" w:type="dxa"/>
-              <w:bottom w:w="70" w:type="dxa"/>
-              <w:start w:w="95" w:type="dxa"/>
-              <w:end w:w="95" w:type="dxa"/>
-            </w:tcMar>
-          </w:tcPr>
-          <w:p>
-            <w:pPr>
-              <w:spacing w:after="0" w:line="247" w:lineRule="auto"/>
-            </w:pPr>
-            <w:r/>
-            <w:r>
-              <w:rPr>
-                <w:rFonts w:ascii="Microsoft YaHei" w:hAnsi="Microsoft YaHei" w:eastAsia="Microsoft YaHei" w:cs="Microsoft YaHei"/>
-                <w:b w:val="0"/>
-                <w:color w:val="000000"/>
-                <w:sz w:val="17"/>
-              </w:rPr>
-              <w:t>功能保持</w:t>
-            </w:r>
-          </w:p>
-        </w:tc>
-        <w:tc>
-          <w:tcPr>
-            <w:tcW w:type="dxa" w:w="3661"/>
-            <w:vAlign w:val="center"/>
-            <w:tcMar>
-              <w:top w:w="70" w:type="dxa"/>
-              <w:bottom w:w="70" w:type="dxa"/>
-              <w:start w:w="95" w:type="dxa"/>
-              <w:end w:w="95" w:type="dxa"/>
-            </w:tcMar>
-          </w:tcPr>
-          <w:p>
-            <w:pPr>
-              <w:spacing w:after="0" w:line="247" w:lineRule="auto"/>
-            </w:pPr>
-            <w:r/>
-            <w:r>
-              <w:rPr>
-                <w:rFonts w:ascii="Microsoft YaHei" w:hAnsi="Microsoft YaHei" w:eastAsia="Microsoft YaHei" w:cs="Microsoft YaHei"/>
-                <w:b w:val="0"/>
-                <w:color w:val="000000"/>
-                <w:sz w:val="17"/>
-              </w:rPr>
-              <w:t>对表达较好的构建进行结合或功能QC</w:t>
-            </w:r>
-          </w:p>
-        </w:tc>
-        <w:tc>
-          <w:tcPr>
-            <w:tcW w:type="dxa" w:w="4096"/>
-            <w:vAlign w:val="center"/>
-            <w:tcMar>
-              <w:top w:w="70" w:type="dxa"/>
-              <w:bottom w:w="70" w:type="dxa"/>
-              <w:start w:w="95" w:type="dxa"/>
-              <w:end w:w="95" w:type="dxa"/>
-            </w:tcMar>
-          </w:tcPr>
-          <w:p>
-            <w:pPr>
-              <w:spacing w:after="0" w:line="247" w:lineRule="auto"/>
-            </w:pPr>
-            <w:r/>
-            <w:r>
-              <w:rPr>
-                <w:rFonts w:ascii="Microsoft YaHei" w:hAnsi="Microsoft YaHei" w:eastAsia="Microsoft YaHei" w:cs="Microsoft YaHei"/>
-                <w:b w:val="0"/>
-                <w:color w:val="000000"/>
-                <w:sz w:val="17"/>
-              </w:rPr>
-              <w:t>确认冻结直接界面之外的间接构象效应</w:t>
-            </w:r>
-          </w:p>
-        </w:tc>
-      </w:tr>
-      <w:tr>
-        <w:trPr>
-          <w:cantSplit/>
-        </w:trPr>
-        <w:tc>
-          <w:tcPr>
-            <w:tcW w:type="dxa" w:w="1743"/>
-            <w:vAlign w:val="center"/>
-            <w:tcMar>
-              <w:top w:w="70" w:type="dxa"/>
-              <w:bottom w:w="70" w:type="dxa"/>
-              <w:start w:w="95" w:type="dxa"/>
-              <w:end w:w="95" w:type="dxa"/>
-            </w:tcMar>
-          </w:tcPr>
-          <w:p>
-            <w:pPr>
-              <w:spacing w:after="0" w:line="247" w:lineRule="auto"/>
-            </w:pPr>
-            <w:r/>
-            <w:r>
-              <w:rPr>
-                <w:rFonts w:ascii="Microsoft YaHei" w:hAnsi="Microsoft YaHei" w:eastAsia="Microsoft YaHei" w:cs="Microsoft YaHei"/>
-                <w:b w:val="0"/>
-                <w:color w:val="000000"/>
-                <w:sz w:val="17"/>
-              </w:rPr>
-              <w:t>双突比较</w:t>
-            </w:r>
-          </w:p>
-        </w:tc>
-        <w:tc>
-          <w:tcPr>
-            <w:tcW w:type="dxa" w:w="3661"/>
-            <w:vAlign w:val="center"/>
-            <w:tcMar>
-              <w:top w:w="70" w:type="dxa"/>
-              <w:bottom w:w="70" w:type="dxa"/>
-              <w:start w:w="95" w:type="dxa"/>
-              <w:end w:w="95" w:type="dxa"/>
-            </w:tcMar>
-          </w:tcPr>
-          <w:p>
-            <w:pPr>
-              <w:spacing w:after="0" w:line="247" w:lineRule="auto"/>
-            </w:pPr>
-            <w:r/>
-            <w:r>
-              <w:rPr>
-                <w:rFonts w:ascii="Microsoft YaHei" w:hAnsi="Microsoft YaHei" w:eastAsia="Microsoft YaHei" w:cs="Microsoft YaHei"/>
-                <w:b w:val="0"/>
-                <w:color w:val="000000"/>
-                <w:sz w:val="17"/>
-              </w:rPr>
-              <w:t>双突同时与WT和两条组成单突比较</w:t>
-            </w:r>
-          </w:p>
-        </w:tc>
-        <w:tc>
-          <w:tcPr>
-            <w:tcW w:type="dxa" w:w="4096"/>
-            <w:vAlign w:val="center"/>
-            <w:tcMar>
-              <w:top w:w="70" w:type="dxa"/>
-              <w:bottom w:w="70" w:type="dxa"/>
-              <w:start w:w="95" w:type="dxa"/>
-              <w:end w:w="95" w:type="dxa"/>
-            </w:tcMar>
-          </w:tcPr>
-          <w:p>
-            <w:pPr>
-              <w:spacing w:after="0" w:line="247" w:lineRule="auto"/>
-            </w:pPr>
-            <w:r/>
-            <w:r>
-              <w:rPr>
-                <w:rFonts w:ascii="Microsoft YaHei" w:hAnsi="Microsoft YaHei" w:eastAsia="Microsoft YaHei" w:cs="Microsoft YaHei"/>
-                <w:b w:val="0"/>
-                <w:color w:val="000000"/>
-                <w:sz w:val="17"/>
-              </w:rPr>
-              <w:t>判断组合收益及是否出现非加和实验效应</w:t>
-            </w:r>
-          </w:p>
-        </w:tc>
-      </w:tr>
-    </w:tbl>
-    <w:p>
-      <w:r>
-        <w:rPr>
-          <w:rFonts w:ascii="Microsoft YaHei" w:hAnsi="Microsoft YaHei" w:eastAsia="Microsoft YaHei" w:cs="Microsoft YaHei"/>
-          <w:color w:val="000000"/>
-        </w:rPr>
-        <w:t>实验开始前应预先确定成功标准、排除标准、异常值处理和重复策略；本报告不代替实验阈值的预注册。第一轮结果应完整保留正向、中性和负向构建，用于检验当前计算幅度档与专家规则是否适配Nb252。</w:t>
       </w:r>
     </w:p>
     <w:p>
@@ -18363,6 +17688,7 @@
     <w:p>
       <w:pPr>
         <w:pStyle w:val="Heading2"/>
+        <w:pageBreakBefore w:val="0"/>
       </w:pPr>
       <w:r>
         <w:t>B.1 WT母本</w:t>
@@ -18516,6 +17842,7 @@
     <w:p>
       <w:pPr>
         <w:pStyle w:val="Heading2"/>
+        <w:pageBreakBefore w:val="0"/>
       </w:pPr>
       <w:r>
         <w:t>B.2 单突序列</w:t>
@@ -19931,6 +19258,7 @@
     <w:p>
       <w:pPr>
         <w:pStyle w:val="Heading2"/>
+        <w:pageBreakBefore w:val="0"/>
       </w:pPr>
       <w:r>
         <w:t>B.3 双突序列</w:t>

</xml_diff>

<commit_message>
Fix V3 report heading fonts and verify sequences
</commit_message>
<xml_diff>
--- a/docs/result_artifacts/weekly_report_result/Nb252_V3_expression_report/Nb252_BL21_expression_optimization_V3_project_report.docx
+++ b/docs/result_artifacts/weekly_report_result/Nb252_V3_expression_report/Nb252_BL21_expression_optimization_V3_project_report.docx
@@ -423,6 +423,12 @@
         <w:pageBreakBefore/>
       </w:pPr>
       <w:r>
+        <w:rPr>
+          <w:rFonts w:ascii="Microsoft YaHei" w:hAnsi="Microsoft YaHei" w:eastAsia="Microsoft YaHei" w:cs="Microsoft YaHei"/>
+          <w:b/>
+          <w:color w:val="000000"/>
+          <w:sz w:val="30"/>
+        </w:rPr>
         <w:t>执行摘要</w:t>
       </w:r>
     </w:p>
@@ -504,6 +510,12 @@
         <w:pageBreakBefore w:val="0"/>
       </w:pPr>
       <w:r>
+        <w:rPr>
+          <w:rFonts w:ascii="Microsoft YaHei" w:hAnsi="Microsoft YaHei" w:eastAsia="Microsoft YaHei" w:cs="Microsoft YaHei"/>
+          <w:b/>
+          <w:color w:val="000000"/>
+          <w:sz w:val="25"/>
+        </w:rPr>
         <w:t>内容概览</w:t>
       </w:r>
     </w:p>
@@ -953,6 +965,12 @@
         <w:pageBreakBefore/>
       </w:pPr>
       <w:r>
+        <w:rPr>
+          <w:rFonts w:ascii="Microsoft YaHei" w:hAnsi="Microsoft YaHei" w:eastAsia="Microsoft YaHei" w:cs="Microsoft YaHei"/>
+          <w:b/>
+          <w:color w:val="000000"/>
+          <w:sz w:val="30"/>
+        </w:rPr>
         <w:t>1. 项目目标与母本身份</w:t>
       </w:r>
     </w:p>
@@ -1302,6 +1320,12 @@
         <w:pageBreakBefore/>
       </w:pPr>
       <w:r>
+        <w:rPr>
+          <w:rFonts w:ascii="Microsoft YaHei" w:hAnsi="Microsoft YaHei" w:eastAsia="Microsoft YaHei" w:cs="Microsoft YaHei"/>
+          <w:b/>
+          <w:color w:val="000000"/>
+          <w:sz w:val="30"/>
+        </w:rPr>
         <w:t>2. 硬约束与结构证据边界</w:t>
       </w:r>
     </w:p>
@@ -1829,6 +1853,12 @@
         <w:pageBreakBefore/>
       </w:pPr>
       <w:r>
+        <w:rPr>
+          <w:rFonts w:ascii="Microsoft YaHei" w:hAnsi="Microsoft YaHei" w:eastAsia="Microsoft YaHei" w:cs="Microsoft YaHei"/>
+          <w:b/>
+          <w:color w:val="000000"/>
+          <w:sz w:val="30"/>
+        </w:rPr>
         <w:t>3. 天然VHH保守性约束</w:t>
       </w:r>
     </w:p>
@@ -1946,6 +1976,12 @@
         <w:pageBreakBefore/>
       </w:pPr>
       <w:r>
+        <w:rPr>
+          <w:rFonts w:ascii="Microsoft YaHei" w:hAnsi="Microsoft YaHei" w:eastAsia="Microsoft YaHei" w:cs="Microsoft YaHei"/>
+          <w:b/>
+          <w:color w:val="000000"/>
+          <w:sz w:val="30"/>
+        </w:rPr>
         <w:t>4. 预测工具验证与在V3中的角色</w:t>
       </w:r>
     </w:p>
@@ -2565,6 +2601,12 @@
         <w:pageBreakBefore w:val="0"/>
       </w:pPr>
       <w:r>
+        <w:rPr>
+          <w:rFonts w:ascii="Microsoft YaHei" w:hAnsi="Microsoft YaHei" w:eastAsia="Microsoft YaHei" w:cs="Microsoft YaHei"/>
+          <w:b/>
+          <w:color w:val="000000"/>
+          <w:sz w:val="25"/>
+        </w:rPr>
         <w:t>AntiFold双条件排除规则</w:t>
       </w:r>
     </w:p>
@@ -2583,6 +2625,12 @@
         <w:pageBreakBefore/>
       </w:pPr>
       <w:r>
+        <w:rPr>
+          <w:rFonts w:ascii="Microsoft YaHei" w:hAnsi="Microsoft YaHei" w:eastAsia="Microsoft YaHei" w:cs="Microsoft YaHei"/>
+          <w:b/>
+          <w:color w:val="000000"/>
+          <w:sz w:val="30"/>
+        </w:rPr>
         <w:t>5. 847条允许单突与幅度分档</w:t>
       </w:r>
     </w:p>
@@ -3272,6 +3320,12 @@
         <w:pageBreakBefore/>
       </w:pPr>
       <w:r>
+        <w:rPr>
+          <w:rFonts w:ascii="Microsoft YaHei" w:hAnsi="Microsoft YaHei" w:eastAsia="Microsoft YaHei" w:cs="Microsoft YaHei"/>
+          <w:b/>
+          <w:color w:val="000000"/>
+          <w:sz w:val="30"/>
+        </w:rPr>
         <w:t>6. 从847条单突到15条父单突</w:t>
       </w:r>
     </w:p>
@@ -3972,6 +4026,12 @@
         <w:pageBreakBefore/>
       </w:pPr>
       <w:r>
+        <w:rPr>
+          <w:rFonts w:ascii="Microsoft YaHei" w:hAnsi="Microsoft YaHei" w:eastAsia="Microsoft YaHei" w:cs="Microsoft YaHei"/>
+          <w:b/>
+          <w:color w:val="000000"/>
+          <w:sz w:val="30"/>
+        </w:rPr>
         <w:t>7. 15条父单突的性质与入选依据</w:t>
       </w:r>
     </w:p>
@@ -7231,6 +7291,12 @@
         <w:pageBreakBefore/>
       </w:pPr>
       <w:r>
+        <w:rPr>
+          <w:rFonts w:ascii="Microsoft YaHei" w:hAnsi="Microsoft YaHei" w:eastAsia="Microsoft YaHei" w:cs="Microsoft YaHei"/>
+          <w:b/>
+          <w:color w:val="000000"/>
+          <w:sz w:val="30"/>
+        </w:rPr>
         <w:t>8. 102条双突的完整评价</w:t>
       </w:r>
     </w:p>
@@ -7321,6 +7387,12 @@
         <w:pageBreakBefore/>
       </w:pPr>
       <w:r>
+        <w:rPr>
+          <w:rFonts w:ascii="Microsoft YaHei" w:hAnsi="Microsoft YaHei" w:eastAsia="Microsoft YaHei" w:cs="Microsoft YaHei"/>
+          <w:b/>
+          <w:color w:val="000000"/>
+          <w:sz w:val="30"/>
+        </w:rPr>
         <w:t>9. 15条双突的性质与组合依据</w:t>
       </w:r>
     </w:p>
@@ -10634,6 +10706,12 @@
         <w:pageBreakBefore/>
       </w:pPr>
       <w:r>
+        <w:rPr>
+          <w:rFonts w:ascii="Microsoft YaHei" w:hAnsi="Microsoft YaHei" w:eastAsia="Microsoft YaHei" w:cs="Microsoft YaHei"/>
+          <w:b/>
+          <w:color w:val="000000"/>
+          <w:sz w:val="30"/>
+        </w:rPr>
         <w:t>10. 最终30条候选面板</w:t>
       </w:r>
     </w:p>
@@ -10652,6 +10730,12 @@
         <w:pageBreakBefore w:val="0"/>
       </w:pPr>
       <w:r>
+        <w:rPr>
+          <w:rFonts w:ascii="Microsoft YaHei" w:hAnsi="Microsoft YaHei" w:eastAsia="Microsoft YaHei" w:cs="Microsoft YaHei"/>
+          <w:b/>
+          <w:color w:val="000000"/>
+          <w:sz w:val="25"/>
+        </w:rPr>
         <w:t>10.1 单突（15条）</w:t>
       </w:r>
     </w:p>
@@ -12940,6 +13024,12 @@
         <w:pageBreakBefore w:val="0"/>
       </w:pPr>
       <w:r>
+        <w:rPr>
+          <w:rFonts w:ascii="Microsoft YaHei" w:hAnsi="Microsoft YaHei" w:eastAsia="Microsoft YaHei" w:cs="Microsoft YaHei"/>
+          <w:b/>
+          <w:color w:val="000000"/>
+          <w:sz w:val="25"/>
+        </w:rPr>
         <w:t>10.2 双突（15条）</w:t>
       </w:r>
     </w:p>
@@ -15237,6 +15327,12 @@
         <w:pageBreakBefore w:val="0"/>
       </w:pPr>
       <w:r>
+        <w:rPr>
+          <w:rFonts w:ascii="Microsoft YaHei" w:hAnsi="Microsoft YaHei" w:eastAsia="Microsoft YaHei" w:cs="Microsoft YaHei"/>
+          <w:b/>
+          <w:color w:val="000000"/>
+          <w:sz w:val="30"/>
+        </w:rPr>
         <w:t>11. 预测结果的适用边界</w:t>
       </w:r>
     </w:p>
@@ -15291,6 +15387,12 @@
         <w:pageBreakBefore w:val="0"/>
       </w:pPr>
       <w:r>
+        <w:rPr>
+          <w:rFonts w:ascii="Microsoft YaHei" w:hAnsi="Microsoft YaHei" w:eastAsia="Microsoft YaHei" w:cs="Microsoft YaHei"/>
+          <w:b/>
+          <w:color w:val="000000"/>
+          <w:sz w:val="30"/>
+        </w:rPr>
         <w:t>附录A  指标和符号说明</w:t>
       </w:r>
     </w:p>
@@ -15681,6 +15783,12 @@
         <w:pageBreakBefore/>
       </w:pPr>
       <w:r>
+        <w:rPr>
+          <w:rFonts w:ascii="Microsoft YaHei" w:hAnsi="Microsoft YaHei" w:eastAsia="Microsoft YaHei" w:cs="Microsoft YaHei"/>
+          <w:b/>
+          <w:color w:val="000000"/>
+          <w:sz w:val="30"/>
+        </w:rPr>
         <w:t>附录B  母本与最终30条完整序列</w:t>
       </w:r>
     </w:p>
@@ -15699,6 +15807,12 @@
         <w:pageBreakBefore w:val="0"/>
       </w:pPr>
       <w:r>
+        <w:rPr>
+          <w:rFonts w:ascii="Microsoft YaHei" w:hAnsi="Microsoft YaHei" w:eastAsia="Microsoft YaHei" w:cs="Microsoft YaHei"/>
+          <w:b/>
+          <w:color w:val="000000"/>
+          <w:sz w:val="25"/>
+        </w:rPr>
         <w:t>B.1 WT母本</w:t>
       </w:r>
     </w:p>
@@ -15853,6 +15967,12 @@
         <w:pageBreakBefore w:val="0"/>
       </w:pPr>
       <w:r>
+        <w:rPr>
+          <w:rFonts w:ascii="Microsoft YaHei" w:hAnsi="Microsoft YaHei" w:eastAsia="Microsoft YaHei" w:cs="Microsoft YaHei"/>
+          <w:b/>
+          <w:color w:val="000000"/>
+          <w:sz w:val="25"/>
+        </w:rPr>
         <w:t>B.2 单突序列</w:t>
       </w:r>
     </w:p>
@@ -17269,6 +17389,12 @@
         <w:pageBreakBefore w:val="0"/>
       </w:pPr>
       <w:r>
+        <w:rPr>
+          <w:rFonts w:ascii="Microsoft YaHei" w:hAnsi="Microsoft YaHei" w:eastAsia="Microsoft YaHei" w:cs="Microsoft YaHei"/>
+          <w:b/>
+          <w:color w:val="000000"/>
+          <w:sz w:val="25"/>
+        </w:rPr>
         <w:t>B.3 双突序列</w:t>
       </w:r>
     </w:p>
@@ -19147,7 +19273,7 @@
       <w:outlineLvl w:val="0"/>
     </w:pPr>
     <w:rPr>
-      <w:rFonts w:asciiTheme="majorHAnsi" w:eastAsiaTheme="majorEastAsia" w:hAnsiTheme="majorHAnsi" w:cstheme="majorBidi" w:ascii="Microsoft YaHei" w:hAnsi="Microsoft YaHei" w:eastAsia="Microsoft YaHei" w:cs="Microsoft YaHei"/>
+      <w:rFonts w:ascii="Microsoft YaHei" w:hAnsi="Microsoft YaHei" w:eastAsia="Microsoft YaHei" w:cs="Microsoft YaHei"/>
       <w:b/>
       <w:bCs/>
       <w:color w:val="000000"/>
@@ -19171,7 +19297,7 @@
       <w:outlineLvl w:val="1"/>
     </w:pPr>
     <w:rPr>
-      <w:rFonts w:asciiTheme="majorHAnsi" w:eastAsiaTheme="majorEastAsia" w:hAnsiTheme="majorHAnsi" w:cstheme="majorBidi" w:ascii="Microsoft YaHei" w:hAnsi="Microsoft YaHei" w:eastAsia="Microsoft YaHei" w:cs="Microsoft YaHei"/>
+      <w:rFonts w:ascii="Microsoft YaHei" w:hAnsi="Microsoft YaHei" w:eastAsia="Microsoft YaHei" w:cs="Microsoft YaHei"/>
       <w:b/>
       <w:bCs/>
       <w:color w:val="000000"/>
@@ -19436,7 +19562,7 @@
       <w:contextualSpacing/>
     </w:pPr>
     <w:rPr>
-      <w:rFonts w:asciiTheme="majorHAnsi" w:eastAsiaTheme="majorEastAsia" w:hAnsiTheme="majorHAnsi" w:cstheme="majorBidi" w:ascii="Microsoft YaHei" w:hAnsi="Microsoft YaHei" w:eastAsia="Microsoft YaHei" w:cs="Microsoft YaHei"/>
+      <w:rFonts w:ascii="Microsoft YaHei" w:hAnsi="Microsoft YaHei" w:eastAsia="Microsoft YaHei" w:cs="Microsoft YaHei"/>
       <w:b/>
       <w:color w:val="000000"/>
       <w:spacing w:val="5"/>
@@ -19475,7 +19601,7 @@
       <w:spacing w:before="0" w:after="100" w:line="240" w:lineRule="auto"/>
     </w:pPr>
     <w:rPr>
-      <w:rFonts w:asciiTheme="majorHAnsi" w:eastAsiaTheme="majorEastAsia" w:hAnsiTheme="majorHAnsi" w:cstheme="majorBidi" w:ascii="Microsoft YaHei" w:hAnsi="Microsoft YaHei" w:eastAsia="Microsoft YaHei" w:cs="Microsoft YaHei"/>
+      <w:rFonts w:ascii="Microsoft YaHei" w:hAnsi="Microsoft YaHei" w:eastAsia="Microsoft YaHei" w:cs="Microsoft YaHei"/>
       <w:b w:val="0"/>
       <w:i/>
       <w:iCs/>

</xml_diff>